<commit_message>
[ADD] evaluation, delete prompt version control experiment
</commit_message>
<xml_diff>
--- a/AI_masterprompt_plan.docx
+++ b/AI_masterprompt_plan.docx
@@ -2419,7 +2419,7 @@
           <w:noProof/>
         </w:rPr>
         <w:drawing>
-          <wp:anchor distT="0" distB="0" distL="114300" distR="114300" simplePos="0" relativeHeight="251659264" behindDoc="0" locked="0" layoutInCell="1" allowOverlap="1" wp14:anchorId="43C81F56" wp14:editId="46396437">
+          <wp:anchor distT="0" distB="0" distL="114300" distR="114300" simplePos="0" relativeHeight="251659264" behindDoc="0" locked="0" layoutInCell="1" allowOverlap="1" wp14:anchorId="43C81F56" wp14:editId="072C2AF6">
             <wp:simplePos x="0" y="0"/>
             <wp:positionH relativeFrom="column">
               <wp:posOffset>61986</wp:posOffset>
@@ -2653,52 +2653,22 @@
           <w:szCs w:val="24"/>
         </w:rPr>
       </w:pPr>
-      <w:proofErr w:type="spellStart"/>
-      <w:r>
-        <w:rPr>
-          <w:b/>
-          <w:bCs/>
-          <w:color w:val="000000" w:themeColor="text1"/>
-          <w:sz w:val="24"/>
-          <w:szCs w:val="24"/>
-        </w:rPr>
-        <w:t>BERTScore</w:t>
-      </w:r>
-      <w:proofErr w:type="spellEnd"/>
-      <w:r>
-        <w:rPr>
-          <w:color w:val="000000" w:themeColor="text1"/>
-          <w:sz w:val="24"/>
-          <w:szCs w:val="24"/>
-        </w:rPr>
-        <w:t xml:space="preserve">: measure semantic similarity between the master prompt and the </w:t>
-      </w:r>
-      <w:r>
-        <w:rPr>
-          <w:color w:val="000000" w:themeColor="text1"/>
-          <w:sz w:val="24"/>
-          <w:szCs w:val="24"/>
-        </w:rPr>
-        <w:t>ground truth</w:t>
-      </w:r>
-    </w:p>
-    <w:p>
-      <w:pPr>
-        <w:spacing w:after="120"/>
-        <w:rPr>
-          <w:color w:val="000000" w:themeColor="text1"/>
-          <w:sz w:val="24"/>
-          <w:szCs w:val="24"/>
-        </w:rPr>
-      </w:pPr>
       <w:r>
         <w:rPr>
           <w:noProof/>
         </w:rPr>
         <w:drawing>
-          <wp:inline distT="0" distB="0" distL="0" distR="0" wp14:anchorId="68C66BA3" wp14:editId="5A5C740B">
+          <wp:anchor distT="0" distB="0" distL="114300" distR="114300" simplePos="0" relativeHeight="251661312" behindDoc="0" locked="0" layoutInCell="1" allowOverlap="1" wp14:anchorId="68C66BA3" wp14:editId="7D281EA2">
+            <wp:simplePos x="0" y="0"/>
+            <wp:positionH relativeFrom="column">
+              <wp:posOffset>-69448</wp:posOffset>
+            </wp:positionH>
+            <wp:positionV relativeFrom="paragraph">
+              <wp:posOffset>422910</wp:posOffset>
+            </wp:positionV>
             <wp:extent cx="5943600" cy="1617980"/>
             <wp:effectExtent l="0" t="0" r="0" b="1270"/>
+            <wp:wrapTopAndBottom/>
             <wp:docPr id="155277928" name="Picture 1"/>
             <wp:cNvGraphicFramePr>
               <a:graphicFrameLocks xmlns:a="http://schemas.openxmlformats.org/drawingml/2006/main" noChangeAspect="1"/>
@@ -2711,7 +2681,13 @@
                     <pic:cNvPicPr/>
                   </pic:nvPicPr>
                   <pic:blipFill>
-                    <a:blip r:embed="rId22"/>
+                    <a:blip r:embed="rId22" cstate="print">
+                      <a:extLst>
+                        <a:ext uri="{28A0092B-C50C-407E-A947-70E740481C1C}">
+                          <a14:useLocalDpi xmlns:a14="http://schemas.microsoft.com/office/drawing/2010/main" val="0"/>
+                        </a:ext>
+                      </a:extLst>
+                    </a:blip>
                     <a:stretch>
                       <a:fillRect/>
                     </a:stretch>
@@ -2728,30 +2704,104 @@
                 </pic:pic>
               </a:graphicData>
             </a:graphic>
-          </wp:inline>
+            <wp14:sizeRelH relativeFrom="page">
+              <wp14:pctWidth>0</wp14:pctWidth>
+            </wp14:sizeRelH>
+            <wp14:sizeRelV relativeFrom="page">
+              <wp14:pctHeight>0</wp14:pctHeight>
+            </wp14:sizeRelV>
+          </wp:anchor>
         </w:drawing>
       </w:r>
-    </w:p>
-    <w:p>
-      <w:pPr>
-        <w:spacing w:after="120"/>
-        <w:rPr>
-          <w:color w:val="000000" w:themeColor="text1"/>
-          <w:sz w:val="24"/>
-          <w:szCs w:val="24"/>
-        </w:rPr>
-      </w:pPr>
+      <w:proofErr w:type="spellStart"/>
+      <w:r>
+        <w:rPr>
+          <w:b/>
+          <w:bCs/>
+          <w:color w:val="000000" w:themeColor="text1"/>
+          <w:sz w:val="24"/>
+          <w:szCs w:val="24"/>
+        </w:rPr>
+        <w:t>BERTScore</w:t>
+      </w:r>
+      <w:proofErr w:type="spellEnd"/>
+      <w:r>
+        <w:rPr>
+          <w:color w:val="000000" w:themeColor="text1"/>
+          <w:sz w:val="24"/>
+          <w:szCs w:val="24"/>
+        </w:rPr>
+        <w:t xml:space="preserve">: measure semantic similarity between the master prompt and the </w:t>
+      </w:r>
+      <w:r>
+        <w:rPr>
+          <w:color w:val="000000" w:themeColor="text1"/>
+          <w:sz w:val="24"/>
+          <w:szCs w:val="24"/>
+        </w:rPr>
+        <w:t>ground truth</w:t>
+      </w:r>
     </w:p>
     <w:p>
       <w:pPr>
         <w:spacing w:after="120"/>
         <w:ind w:left="720"/>
         <w:rPr>
-          <w:color w:val="000000" w:themeColor="text1"/>
-          <w:sz w:val="24"/>
-          <w:szCs w:val="24"/>
-        </w:rPr>
-      </w:pPr>
+          <w:rFonts w:ascii="Consolas" w:eastAsia="Times New Roman" w:hAnsi="Consolas" w:cs="Times New Roman"/>
+          <w:color w:val="BBBEBF"/>
+        </w:rPr>
+      </w:pPr>
+      <w:r>
+        <w:rPr>
+          <w:color w:val="000000" w:themeColor="text1"/>
+          <w:sz w:val="24"/>
+          <w:szCs w:val="24"/>
+        </w:rPr>
+        <w:t>M</w:t>
+      </w:r>
+      <w:r>
+        <w:rPr>
+          <w:color w:val="000000" w:themeColor="text1"/>
+          <w:sz w:val="24"/>
+          <w:szCs w:val="24"/>
+        </w:rPr>
+        <w:t xml:space="preserve">odel use: </w:t>
+      </w:r>
+      <w:proofErr w:type="spellStart"/>
+      <w:r>
+        <w:rPr>
+          <w:rFonts w:ascii="Consolas" w:eastAsia="Times New Roman" w:hAnsi="Consolas" w:cs="Times New Roman"/>
+          <w:color w:val="BBBEBF"/>
+          <w:highlight w:val="black"/>
+        </w:rPr>
+        <w:t>microsoft</w:t>
+      </w:r>
+      <w:proofErr w:type="spellEnd"/>
+      <w:r>
+        <w:rPr>
+          <w:rFonts w:ascii="Consolas" w:eastAsia="Times New Roman" w:hAnsi="Consolas" w:cs="Times New Roman"/>
+          <w:color w:val="BBBEBF"/>
+          <w:highlight w:val="black"/>
+        </w:rPr>
+        <w:t>/</w:t>
+      </w:r>
+      <w:proofErr w:type="spellStart"/>
+      <w:r>
+        <w:rPr>
+          <w:rFonts w:ascii="Consolas" w:eastAsia="Times New Roman" w:hAnsi="Consolas" w:cs="Times New Roman"/>
+          <w:color w:val="BBBEBF"/>
+          <w:highlight w:val="black"/>
+        </w:rPr>
+        <w:t>deberta-xlarge-mnli</w:t>
+      </w:r>
+      <w:proofErr w:type="spellEnd"/>
+      <w:r>
+        <w:rPr>
+          <w:rFonts w:ascii="Consolas" w:eastAsia="Times New Roman" w:hAnsi="Consolas" w:cs="Times New Roman"/>
+          <w:color w:val="BBBEBF"/>
+        </w:rPr>
+        <w:t xml:space="preserve"> </w:t>
+      </w:r>
     </w:p>
     <w:p>
       <w:pPr>
@@ -2766,74 +2816,17 @@
       </w:pPr>
       <w:r>
         <w:rPr>
-          <w:color w:val="000000" w:themeColor="text1"/>
-          <w:sz w:val="24"/>
-          <w:szCs w:val="24"/>
-        </w:rPr>
-        <w:t xml:space="preserve">Model use: </w:t>
-      </w:r>
-      <w:proofErr w:type="spellStart"/>
-      <w:r>
-        <w:rPr>
-          <w:rFonts w:ascii="Consolas" w:hAnsi="Consolas"/>
-          <w:color w:val="F0F6FC"/>
-          <w:sz w:val="20"/>
-          <w:szCs w:val="20"/>
-          <w:highlight w:val="darkGray"/>
-        </w:rPr>
-        <w:t>microsoft</w:t>
-      </w:r>
-      <w:proofErr w:type="spellEnd"/>
-      <w:r>
-        <w:rPr>
-          <w:rFonts w:ascii="Consolas" w:hAnsi="Consolas"/>
-          <w:color w:val="F0F6FC"/>
-          <w:sz w:val="20"/>
-          <w:szCs w:val="20"/>
-          <w:highlight w:val="darkGray"/>
-        </w:rPr>
-        <w:t>/</w:t>
-      </w:r>
-      <w:proofErr w:type="spellStart"/>
-      <w:r>
-        <w:rPr>
-          <w:rFonts w:ascii="Consolas" w:hAnsi="Consolas"/>
-          <w:color w:val="F0F6FC"/>
-          <w:sz w:val="20"/>
-          <w:szCs w:val="20"/>
-          <w:highlight w:val="darkGray"/>
-        </w:rPr>
-        <w:t>deberta-xlarge-mnli</w:t>
-      </w:r>
-      <w:proofErr w:type="spellEnd"/>
-    </w:p>
-    <w:p>
-      <w:pPr>
-        <w:pStyle w:val="ListParagraph"/>
-        <w:spacing w:after="120"/>
-        <w:ind w:left="720"/>
-        <w:rPr>
-          <w:color w:val="000000" w:themeColor="text1"/>
-          <w:sz w:val="24"/>
-          <w:szCs w:val="24"/>
-        </w:rPr>
-      </w:pPr>
-      <w:r>
-        <w:rPr>
           <w:noProof/>
-          <w:color w:val="000000" w:themeColor="text1"/>
-          <w:sz w:val="24"/>
-          <w:szCs w:val="24"/>
         </w:rPr>
         <w:lastRenderedPageBreak/>
         <w:drawing>
-          <wp:anchor distT="0" distB="0" distL="114300" distR="114300" simplePos="0" relativeHeight="251660288" behindDoc="0" locked="0" layoutInCell="1" allowOverlap="1" wp14:anchorId="30A6D185" wp14:editId="078D7DCD">
+          <wp:anchor distT="0" distB="0" distL="114300" distR="114300" simplePos="0" relativeHeight="251660288" behindDoc="0" locked="0" layoutInCell="1" allowOverlap="1" wp14:anchorId="30A6D185" wp14:editId="141B55BC">
             <wp:simplePos x="0" y="0"/>
             <wp:positionH relativeFrom="column">
-              <wp:posOffset>5862</wp:posOffset>
+              <wp:posOffset>109887</wp:posOffset>
             </wp:positionH>
             <wp:positionV relativeFrom="paragraph">
-              <wp:posOffset>456565</wp:posOffset>
+              <wp:posOffset>496088</wp:posOffset>
             </wp:positionV>
             <wp:extent cx="5650865" cy="3528060"/>
             <wp:effectExtent l="0" t="0" r="6985" b="0"/>
@@ -2896,15 +2889,7 @@
           <w:sz w:val="24"/>
           <w:szCs w:val="24"/>
         </w:rPr>
-        <w:t>following</w:t>
-      </w:r>
-      <w:r>
-        <w:rPr>
-          <w:color w:val="000000" w:themeColor="text1"/>
-          <w:sz w:val="24"/>
-          <w:szCs w:val="24"/>
-        </w:rPr>
-        <w:t xml:space="preserve"> the </w:t>
+        <w:t xml:space="preserve">following the </w:t>
       </w:r>
       <w:proofErr w:type="spellStart"/>
       <w:r>
@@ -2960,9 +2945,285 @@
           <w:t>https://arxiv.org/pdf/1904.09675</w:t>
         </w:r>
       </w:hyperlink>
+    </w:p>
+    <w:p>
+      <w:pPr>
+        <w:pStyle w:val="ListParagraph"/>
+        <w:spacing w:after="120"/>
+        <w:ind w:left="720"/>
+        <w:rPr>
+          <w:color w:val="000000" w:themeColor="text1"/>
+          <w:sz w:val="24"/>
+          <w:szCs w:val="24"/>
+        </w:rPr>
+      </w:pPr>
       <w:r>
         <w:br/>
       </w:r>
+    </w:p>
+    <w:p>
+      <w:pPr>
+        <w:spacing w:after="120"/>
+      </w:pPr>
+      <w:r>
+        <w:rPr>
+          <w:noProof/>
+          <w:color w:val="000000" w:themeColor="text1"/>
+          <w:sz w:val="24"/>
+          <w:szCs w:val="24"/>
+        </w:rPr>
+        <w:drawing>
+          <wp:anchor distT="0" distB="0" distL="114300" distR="114300" simplePos="0" relativeHeight="251662336" behindDoc="0" locked="0" layoutInCell="1" allowOverlap="1" wp14:anchorId="1A41E243" wp14:editId="3AA99BBF">
+            <wp:simplePos x="0" y="0"/>
+            <wp:positionH relativeFrom="column">
+              <wp:posOffset>326834</wp:posOffset>
+            </wp:positionH>
+            <wp:positionV relativeFrom="paragraph">
+              <wp:posOffset>475615</wp:posOffset>
+            </wp:positionV>
+            <wp:extent cx="5428526" cy="3306413"/>
+            <wp:effectExtent l="0" t="0" r="1270" b="8890"/>
+            <wp:wrapTopAndBottom/>
+            <wp:docPr id="1298035157" name="Picture 1"/>
+            <wp:cNvGraphicFramePr>
+              <a:graphicFrameLocks xmlns:a="http://schemas.openxmlformats.org/drawingml/2006/main" noChangeAspect="1"/>
+            </wp:cNvGraphicFramePr>
+            <a:graphic xmlns:a="http://schemas.openxmlformats.org/drawingml/2006/main">
+              <a:graphicData uri="http://schemas.openxmlformats.org/drawingml/2006/picture">
+                <pic:pic xmlns:pic="http://schemas.openxmlformats.org/drawingml/2006/picture">
+                  <pic:nvPicPr>
+                    <pic:cNvPr id="1298035157" name=""/>
+                    <pic:cNvPicPr/>
+                  </pic:nvPicPr>
+                  <pic:blipFill>
+                    <a:blip r:embed="rId25">
+                      <a:extLst>
+                        <a:ext uri="{28A0092B-C50C-407E-A947-70E740481C1C}">
+                          <a14:useLocalDpi xmlns:a14="http://schemas.microsoft.com/office/drawing/2010/main" val="0"/>
+                        </a:ext>
+                      </a:extLst>
+                    </a:blip>
+                    <a:stretch>
+                      <a:fillRect/>
+                    </a:stretch>
+                  </pic:blipFill>
+                  <pic:spPr>
+                    <a:xfrm>
+                      <a:off x="0" y="0"/>
+                      <a:ext cx="5428526" cy="3306413"/>
+                    </a:xfrm>
+                    <a:prstGeom prst="rect">
+                      <a:avLst/>
+                    </a:prstGeom>
+                  </pic:spPr>
+                </pic:pic>
+              </a:graphicData>
+            </a:graphic>
+            <wp14:sizeRelH relativeFrom="page">
+              <wp14:pctWidth>0</wp14:pctWidth>
+            </wp14:sizeRelH>
+            <wp14:sizeRelV relativeFrom="page">
+              <wp14:pctHeight>0</wp14:pctHeight>
+            </wp14:sizeRelV>
+          </wp:anchor>
+        </w:drawing>
+      </w:r>
+      <w:proofErr w:type="spellStart"/>
+      <w:r>
+        <w:rPr>
+          <w:b/>
+          <w:bCs/>
+        </w:rPr>
+        <w:t>AlignScore</w:t>
+      </w:r>
+      <w:proofErr w:type="spellEnd"/>
+      <w:r>
+        <w:t>: measure whether each requirement in the master prompt is actually supported by (entailed by) the ground truth</w:t>
+      </w:r>
+      <w:r>
+        <w:t>.</w:t>
+      </w:r>
+      <w:r>
+        <w:rPr>
+          <w:color w:val="000000" w:themeColor="text1"/>
+          <w:sz w:val="24"/>
+          <w:szCs w:val="24"/>
+        </w:rPr>
+        <w:t xml:space="preserve"> </w:t>
+      </w:r>
+    </w:p>
+    <w:p>
+      <w:pPr>
+        <w:spacing w:after="120"/>
+        <w:rPr>
+          <w:color w:val="000000" w:themeColor="text1"/>
+          <w:sz w:val="24"/>
+          <w:szCs w:val="24"/>
+        </w:rPr>
+      </w:pPr>
+    </w:p>
+    <w:p>
+      <w:r>
+        <w:t xml:space="preserve">Different from </w:t>
+      </w:r>
+      <w:proofErr w:type="spellStart"/>
+      <w:r>
+        <w:t>BERTScore</w:t>
+      </w:r>
+      <w:proofErr w:type="spellEnd"/>
+      <w:r>
+        <w:t xml:space="preserve"> that only compares embeddings, </w:t>
+      </w:r>
+      <w:proofErr w:type="spellStart"/>
+      <w:r>
+        <w:t>AlignScore</w:t>
+      </w:r>
+      <w:proofErr w:type="spellEnd"/>
+      <w:r>
+        <w:t xml:space="preserve"> feeds the ground truth (context) and the master prompt (claim) into the model at the same time and predicts if the claim is entailed by the context =&gt; it can tell a real support from a contradiction or an added requirement, not only similarity.</w:t>
+      </w:r>
+    </w:p>
+    <w:p>
+      <w:r>
+        <w:t>It is directional so I run it two times: precision = is the master prompt supported by the ground truth (to catch added / non-traceable content), recall = is each ground truth requirement supported by the master prompt (to catch dropped requirement).</w:t>
+      </w:r>
+    </w:p>
+    <w:p>
+      <w:r>
+        <w:t xml:space="preserve">To handle long text, it splits the context into around 350-token chunks and the claim into sentences, then for each claim sentence it takes the highest alignment over the chunks and takes the average, so it is not truncated like </w:t>
+      </w:r>
+      <w:proofErr w:type="spellStart"/>
+      <w:r>
+        <w:t>BERTScore</w:t>
+      </w:r>
+      <w:proofErr w:type="spellEnd"/>
+      <w:r>
+        <w:t>.</w:t>
+      </w:r>
+    </w:p>
+    <w:p/>
+    <w:p>
+      <w:pPr>
+        <w:rPr>
+          <w:rFonts w:ascii="Consolas" w:eastAsia="Times New Roman" w:hAnsi="Consolas" w:cs="Times New Roman"/>
+          <w:color w:val="BBBEBF"/>
+        </w:rPr>
+      </w:pPr>
+      <w:r>
+        <w:t xml:space="preserve">Model use: </w:t>
+      </w:r>
+      <w:proofErr w:type="spellStart"/>
+      <w:r>
+        <w:rPr>
+          <w:rFonts w:ascii="Consolas" w:eastAsia="Times New Roman" w:hAnsi="Consolas" w:cs="Times New Roman"/>
+          <w:color w:val="BBBEBF"/>
+          <w:highlight w:val="black"/>
+        </w:rPr>
+        <w:t>AlignScore</w:t>
+      </w:r>
+      <w:proofErr w:type="spellEnd"/>
+      <w:r>
+        <w:rPr>
+          <w:rFonts w:ascii="Consolas" w:eastAsia="Times New Roman" w:hAnsi="Consolas" w:cs="Times New Roman"/>
+          <w:color w:val="BBBEBF"/>
+          <w:highlight w:val="black"/>
+        </w:rPr>
+        <w:t>-large (</w:t>
+      </w:r>
+      <w:r>
+        <w:rPr>
+          <w:rFonts w:ascii="Consolas" w:eastAsia="Times New Roman" w:hAnsi="Consolas" w:cs="Times New Roman"/>
+          <w:color w:val="BBBEBF"/>
+          <w:highlight w:val="black"/>
+        </w:rPr>
+        <w:t xml:space="preserve">base: </w:t>
+      </w:r>
+      <w:proofErr w:type="spellStart"/>
+      <w:r>
+        <w:rPr>
+          <w:rFonts w:ascii="Consolas" w:eastAsia="Times New Roman" w:hAnsi="Consolas" w:cs="Times New Roman"/>
+          <w:color w:val="BBBEBF"/>
+          <w:highlight w:val="black"/>
+        </w:rPr>
+        <w:t>RoBERTa</w:t>
+      </w:r>
+      <w:proofErr w:type="spellEnd"/>
+      <w:r>
+        <w:rPr>
+          <w:rFonts w:ascii="Consolas" w:eastAsia="Times New Roman" w:hAnsi="Consolas" w:cs="Times New Roman"/>
+          <w:color w:val="BBBEBF"/>
+          <w:highlight w:val="black"/>
+        </w:rPr>
+        <w:t>-l</w:t>
+      </w:r>
+      <w:r>
+        <w:rPr>
+          <w:rFonts w:ascii="Consolas" w:eastAsia="Times New Roman" w:hAnsi="Consolas" w:cs="Times New Roman"/>
+          <w:color w:val="BBBEBF"/>
+          <w:highlight w:val="black"/>
+        </w:rPr>
+        <w:t>arge</w:t>
+      </w:r>
+      <w:r>
+        <w:rPr>
+          <w:rFonts w:ascii="Consolas" w:eastAsia="Times New Roman" w:hAnsi="Consolas" w:cs="Times New Roman"/>
+          <w:color w:val="BBBEBF"/>
+          <w:highlight w:val="black"/>
+        </w:rPr>
+        <w:t xml:space="preserve"> (355M)</w:t>
+      </w:r>
+      <w:r>
+        <w:rPr>
+          <w:rFonts w:ascii="Consolas" w:eastAsia="Times New Roman" w:hAnsi="Consolas" w:cs="Times New Roman"/>
+          <w:color w:val="BBBEBF"/>
+          <w:highlight w:val="black"/>
+        </w:rPr>
+        <w:t>)</w:t>
+      </w:r>
+    </w:p>
+    <w:p/>
+    <w:p>
+      <w:pPr>
+        <w:pStyle w:val="ListParagraph"/>
+      </w:pPr>
+      <w:r>
+        <w:t xml:space="preserve">I use the large checkpoint following the </w:t>
+      </w:r>
+      <w:proofErr w:type="spellStart"/>
+      <w:r>
+        <w:t>AlignScore</w:t>
+      </w:r>
+      <w:proofErr w:type="spellEnd"/>
+      <w:r>
+        <w:t xml:space="preserve"> paper</w:t>
+      </w:r>
+      <w:r>
+        <w:t xml:space="preserve">: </w:t>
+      </w:r>
+      <w:hyperlink r:id="rId26" w:history="1">
+        <w:r>
+          <w:rPr>
+            <w:rStyle w:val="Hyperlink"/>
+          </w:rPr>
+          <w:t>https://arxiv.org/pdf/2305.16739</w:t>
+        </w:r>
+      </w:hyperlink>
+      <w:r>
+        <w:t xml:space="preserve"> </w:t>
+      </w:r>
+      <w:r>
+        <w:t>; it is trained on 4.7M examples from 7 tasks (NLI, QA, fact verification, paraphrase, information retrieval, semantic similarity, summarization) and is reported as the strongest checkpoint.</w:t>
+      </w:r>
+    </w:p>
+    <w:p>
+      <w:pPr>
+        <w:spacing w:after="120"/>
+        <w:rPr>
+          <w:color w:val="000000" w:themeColor="text1"/>
+          <w:sz w:val="24"/>
+          <w:szCs w:val="24"/>
+        </w:rPr>
+      </w:pPr>
     </w:p>
     <w:p>
       <w:pPr>
@@ -3177,7 +3438,7 @@
         </w:rPr>
         <w:t xml:space="preserve">: </w:t>
       </w:r>
-      <w:hyperlink r:id="rId25" w:history="1">
+      <w:hyperlink r:id="rId27" w:history="1">
         <w:r>
           <w:rPr>
             <w:rStyle w:val="Hyperlink"/>
@@ -8132,110 +8393,772 @@
     <w:p>
       <w:pPr>
         <w:pStyle w:val="Heading1"/>
-      </w:pPr>
-      <w:r>
+        <w:rPr>
+          <w:color w:val="auto"/>
+        </w:rPr>
+      </w:pPr>
+      <w:r>
+        <w:rPr>
+          <w:color w:val="auto"/>
+        </w:rPr>
         <w:lastRenderedPageBreak/>
-        <w:t>Report 10/07/2026</w:t>
+        <w:t>Report 1</w:t>
+      </w:r>
+      <w:r>
+        <w:rPr>
+          <w:color w:val="auto"/>
+        </w:rPr>
+        <w:t>0</w:t>
+      </w:r>
+      <w:r>
+        <w:rPr>
+          <w:color w:val="auto"/>
+        </w:rPr>
+        <w:t>/07/2026</w:t>
+      </w:r>
+    </w:p>
+    <w:p>
+      <w:r>
+        <w:t xml:space="preserve">   </w:t>
+      </w:r>
+      <w:r>
+        <w:t xml:space="preserve">The idea of evaluating is that to compare between master prompt and ground truth. However, the master prompt contained paraphrasing, reordering, or different words from the ground truth so that if I try to evaluate based on n-gram/token overlap using regular precision, recall, f1, it will be resulted in unreliable evaluation. </w:t>
+      </w:r>
+      <w:r>
+        <w:br/>
+      </w:r>
+      <w:r>
+        <w:t xml:space="preserve">   Instead, the last time I was using </w:t>
+      </w:r>
+      <w:proofErr w:type="spellStart"/>
+      <w:r>
+        <w:t>BERTScore</w:t>
+      </w:r>
+      <w:proofErr w:type="spellEnd"/>
+      <w:r>
+        <w:t xml:space="preserve"> to measures the meaning similarity between the master prompt and the ground truth. It splits every sentence into sub-word tokens, embeds each token into a vector, and matches the tokens that have the highest cosine similarity (greedy match); from these matches it computes precision, recall and F1. Because it works on meaning, it rewards paraphrase and ignores word order. But it has </w:t>
+      </w:r>
+      <w:r>
+        <w:t>3</w:t>
+      </w:r>
+      <w:r>
+        <w:t xml:space="preserve"> problems: it only sees similarity so it cannot tell that two sentences contradict</w:t>
+      </w:r>
+      <w:r>
+        <w:t>. Secondly,</w:t>
+      </w:r>
+      <w:r>
+        <w:t xml:space="preserve"> the model only accepts 512 tokens so a long master prompt is truncated. </w:t>
+      </w:r>
+      <w:r>
+        <w:t xml:space="preserve">Finally, the </w:t>
+      </w:r>
+      <w:proofErr w:type="spellStart"/>
+      <w:r>
+        <w:t>BERTscore</w:t>
+      </w:r>
+      <w:proofErr w:type="spellEnd"/>
+      <w:r>
+        <w:t xml:space="preserve"> have a big problem to </w:t>
+      </w:r>
+      <w:r>
+        <w:t xml:space="preserve">compare the meaning between 2 sentences if it has been paraphrased even though it kept the original requirements. You can take a look at </w:t>
+      </w:r>
+      <w:r>
+        <w:rPr>
+          <w:b/>
+          <w:bCs/>
+        </w:rPr>
+        <w:t xml:space="preserve">Experiment I do for both </w:t>
+      </w:r>
+      <w:proofErr w:type="spellStart"/>
+      <w:r>
+        <w:rPr>
+          <w:b/>
+          <w:bCs/>
+        </w:rPr>
+        <w:t>BERTscore</w:t>
+      </w:r>
+      <w:proofErr w:type="spellEnd"/>
+      <w:r>
+        <w:rPr>
+          <w:b/>
+          <w:bCs/>
+        </w:rPr>
+        <w:t xml:space="preserve"> and </w:t>
+      </w:r>
+      <w:proofErr w:type="spellStart"/>
+      <w:r>
+        <w:rPr>
+          <w:b/>
+          <w:bCs/>
+        </w:rPr>
+        <w:t>Alignscore</w:t>
+      </w:r>
+      <w:proofErr w:type="spellEnd"/>
+      <w:r>
+        <w:t>.</w:t>
+      </w:r>
+    </w:p>
+    <w:p/>
+    <w:p>
+      <w:r>
+        <w:t xml:space="preserve">Model use: </w:t>
+      </w:r>
+      <w:proofErr w:type="spellStart"/>
+      <w:r>
+        <w:t>microsoft</w:t>
+      </w:r>
+      <w:proofErr w:type="spellEnd"/>
+      <w:r>
+        <w:t>/</w:t>
+      </w:r>
+      <w:proofErr w:type="spellStart"/>
+      <w:r>
+        <w:t>deberta-xlarge-mnli</w:t>
+      </w:r>
+      <w:proofErr w:type="spellEnd"/>
+    </w:p>
+    <w:p/>
+    <w:p>
+      <w:pPr>
+        <w:pStyle w:val="ListParagraph"/>
+        <w:numPr>
+          <w:ilvl w:val="0"/>
+          <w:numId w:val="9"/>
+        </w:numPr>
+      </w:pPr>
+      <w:r>
+        <w:t xml:space="preserve">I used this because </w:t>
+      </w:r>
+      <w:proofErr w:type="spellStart"/>
+      <w:r>
+        <w:t>deberta</w:t>
+      </w:r>
+      <w:proofErr w:type="spellEnd"/>
+      <w:r>
+        <w:t xml:space="preserve"> was proved to work better than Roberta and even better if it was finetuned on MNLI in my case. MNLI is a </w:t>
+      </w:r>
+      <w:r>
+        <w:t>task</w:t>
+      </w:r>
+      <w:r>
+        <w:t xml:space="preserve"> where model try</w:t>
+      </w:r>
+      <w:r>
+        <w:t xml:space="preserve"> to predict whether a "</w:t>
+      </w:r>
+      <w:r>
+        <w:t>master prompt</w:t>
+      </w:r>
+      <w:r>
+        <w:t>" entails a "</w:t>
+      </w:r>
+      <w:r>
+        <w:t>ground truth</w:t>
+      </w:r>
+      <w:r>
+        <w:t>," contradicts it, or is neutral.</w:t>
+      </w:r>
+      <w:r>
+        <w:t xml:space="preserve"> Also, the paper </w:t>
+      </w:r>
+      <w:proofErr w:type="spellStart"/>
+      <w:r>
+        <w:t>BERTscore</w:t>
+      </w:r>
+      <w:proofErr w:type="spellEnd"/>
+      <w:r>
+        <w:t xml:space="preserve"> proposed it on their </w:t>
+      </w:r>
+      <w:proofErr w:type="spellStart"/>
+      <w:r>
+        <w:t>github</w:t>
+      </w:r>
+      <w:proofErr w:type="spellEnd"/>
+      <w:r>
+        <w:t xml:space="preserve"> repo</w:t>
+      </w:r>
+    </w:p>
+    <w:p>
+      <w:pPr>
+        <w:pStyle w:val="ListParagraph"/>
+        <w:ind w:left="720"/>
+      </w:pPr>
+    </w:p>
+    <w:p/>
+    <w:p>
+      <w:r>
+        <w:t xml:space="preserve">Because of these problems I use </w:t>
+      </w:r>
+      <w:proofErr w:type="spellStart"/>
+      <w:r>
+        <w:t>AlignScore</w:t>
+      </w:r>
+      <w:proofErr w:type="spellEnd"/>
+      <w:r>
+        <w:t xml:space="preserve"> as the main metric. Instead of comparing embeddings, it feeds the ground truth and the master prompt into a </w:t>
+      </w:r>
+      <w:proofErr w:type="spellStart"/>
+      <w:r>
+        <w:t>RoBERTa</w:t>
+      </w:r>
+      <w:proofErr w:type="spellEnd"/>
+      <w:r>
+        <w:t xml:space="preserve"> model together and predicts if the master prompt is supported (entailed) by the ground truth. It is directional so I run it twice: precision = is the master prompt supported by the ground truth (low = added / non-traceable content), recall = is the ground truth covered by the master prompt (low = dropped requirement). It splits the long context</w:t>
+      </w:r>
+      <w:r>
+        <w:t xml:space="preserve"> (ground truth)</w:t>
+      </w:r>
+      <w:r>
+        <w:t xml:space="preserve"> into around 350-token chunks and the claim </w:t>
+      </w:r>
+      <w:r>
+        <w:t xml:space="preserve">(master prompt) </w:t>
+      </w:r>
+      <w:r>
+        <w:t>into sentences</w:t>
+      </w:r>
+      <w:r>
+        <w:t xml:space="preserve">. But then, I realize a core problem come how the model will split and compare between </w:t>
+      </w:r>
+    </w:p>
+    <w:p/>
+    <w:p>
+      <w:r>
+        <w:t xml:space="preserve">Model use: </w:t>
+      </w:r>
+      <w:proofErr w:type="spellStart"/>
+      <w:r>
+        <w:t>AlignScore</w:t>
+      </w:r>
+      <w:proofErr w:type="spellEnd"/>
+      <w:r>
+        <w:t>-large (</w:t>
+      </w:r>
+      <w:proofErr w:type="spellStart"/>
+      <w:r>
+        <w:t>roberta</w:t>
+      </w:r>
+      <w:proofErr w:type="spellEnd"/>
+      <w:r>
+        <w:t>-large)</w:t>
+      </w:r>
+    </w:p>
+    <w:p/>
+    <w:p>
+      <w:pPr>
+        <w:pStyle w:val="ListParagraph"/>
+        <w:numPr>
+          <w:ilvl w:val="0"/>
+          <w:numId w:val="9"/>
+        </w:numPr>
+      </w:pPr>
+      <w:r>
+        <w:t xml:space="preserve">I also used this based on the </w:t>
+      </w:r>
+      <w:r>
+        <w:t>highest performance</w:t>
+      </w:r>
+      <w:r>
+        <w:t xml:space="preserve"> proposed by paper</w:t>
+      </w:r>
+      <w:r>
+        <w:t xml:space="preserve"> on finding traceability between context (</w:t>
+      </w:r>
+      <w:proofErr w:type="spellStart"/>
+      <w:r>
+        <w:t>gtruth</w:t>
+      </w:r>
+      <w:proofErr w:type="spellEnd"/>
+      <w:r>
+        <w:t>) and candidate (master prompt)</w:t>
       </w:r>
     </w:p>
     <w:p>
       <w:pPr>
         <w:pStyle w:val="Heading2"/>
-      </w:pPr>
+        <w:rPr>
+          <w:color w:val="auto"/>
+        </w:rPr>
+      </w:pPr>
+      <w:r>
+        <w:rPr>
+          <w:color w:val="auto"/>
+        </w:rPr>
+        <w:t xml:space="preserve">Experiment I do for both </w:t>
+      </w:r>
       <w:proofErr w:type="spellStart"/>
       <w:r>
-        <w:t>BERTScore</w:t>
+        <w:rPr>
+          <w:color w:val="auto"/>
+        </w:rPr>
+        <w:t>BERTscore</w:t>
       </w:r>
       <w:proofErr w:type="spellEnd"/>
       <w:r>
-        <w:t xml:space="preserve"> - semantic similarity (secondary)</w:t>
-      </w:r>
-    </w:p>
-    <w:p>
+        <w:rPr>
+          <w:color w:val="auto"/>
+        </w:rPr>
+        <w:t xml:space="preserve"> and </w:t>
+      </w:r>
       <w:proofErr w:type="spellStart"/>
       <w:r>
-        <w:t>BERTScore</w:t>
+        <w:rPr>
+          <w:color w:val="auto"/>
+        </w:rPr>
+        <w:t>Alignscore</w:t>
       </w:r>
       <w:proofErr w:type="spellEnd"/>
-      <w:r>
-        <w:t xml:space="preserve"> splits each text into subword tokens (a token is a subword, not a whole word), embeds each into a contextual vector, and greedy-matches tokens by cosine similarity between vectors, so it credits paraphrase and ignores word order.</w:t>
+    </w:p>
+    <w:p>
+      <w:pPr>
+        <w:pStyle w:val="ListParagraph"/>
+      </w:pPr>
+      <w:r>
+        <w:t xml:space="preserve">To see if the </w:t>
+      </w:r>
+      <w:proofErr w:type="spellStart"/>
+      <w:r>
+        <w:t>BERTscore</w:t>
+      </w:r>
+      <w:proofErr w:type="spellEnd"/>
+      <w:r>
+        <w:t xml:space="preserve"> is enough I also try this simple experiment.</w:t>
+      </w:r>
+    </w:p>
+    <w:p>
+      <w:pPr>
+        <w:pStyle w:val="ListParagraph"/>
+      </w:pPr>
+      <w:r>
+        <w:rPr>
+          <w:u w:val="single"/>
+        </w:rPr>
+        <w:t>Example 1</w:t>
+      </w:r>
+      <w:r>
+        <w:rPr>
+          <w:u w:val="single"/>
+        </w:rPr>
+        <w:t>:</w:t>
+      </w:r>
+      <w:r>
+        <w:t xml:space="preserve"> this example is from the paper </w:t>
+      </w:r>
+      <w:proofErr w:type="spellStart"/>
+      <w:r>
+        <w:t>BERTscore</w:t>
+      </w:r>
+      <w:proofErr w:type="spellEnd"/>
+      <w:r>
+        <w:t>:</w:t>
+      </w:r>
+    </w:p>
+    <w:p>
+      <w:pPr>
+        <w:pStyle w:val="ListParagraph"/>
+        <w:rPr>
+          <w:i/>
+          <w:iCs/>
+        </w:rPr>
+      </w:pPr>
+      <w:r>
+        <w:rPr>
+          <w:i/>
+          <w:iCs/>
+        </w:rPr>
+        <w:t>G</w:t>
+      </w:r>
+      <w:r>
+        <w:rPr>
+          <w:i/>
+          <w:iCs/>
+        </w:rPr>
+        <w:t>round truth</w:t>
+      </w:r>
+    </w:p>
+    <w:p>
+      <w:pPr>
+        <w:pStyle w:val="ListParagraph"/>
+      </w:pPr>
+      <w:r>
+        <w:t xml:space="preserve">"The weather is cold today." </w:t>
+      </w:r>
+    </w:p>
+    <w:p>
+      <w:pPr>
+        <w:pStyle w:val="ListParagraph"/>
+        <w:rPr>
+          <w:i/>
+          <w:iCs/>
+        </w:rPr>
+      </w:pPr>
+      <w:r>
+        <w:rPr>
+          <w:i/>
+          <w:iCs/>
+        </w:rPr>
+        <w:t>M</w:t>
+      </w:r>
+      <w:r>
+        <w:rPr>
+          <w:i/>
+          <w:iCs/>
+        </w:rPr>
+        <w:t xml:space="preserve">aster prompt: </w:t>
+      </w:r>
+    </w:p>
+    <w:p>
+      <w:pPr>
+        <w:pStyle w:val="ListParagraph"/>
+      </w:pPr>
+      <w:r>
+        <w:t>"It is freezing today."</w:t>
+      </w:r>
+    </w:p>
+    <w:p>
+      <w:pPr>
+        <w:pStyle w:val="ListParagraph"/>
+      </w:pPr>
+    </w:p>
+    <w:p>
+      <w:pPr>
+        <w:pStyle w:val="ListParagraph"/>
+        <w:numPr>
+          <w:ilvl w:val="0"/>
+          <w:numId w:val="9"/>
+        </w:numPr>
+      </w:pPr>
+      <w:r>
+        <w:t>It means to see how will the word freezing and cold could trick the metric</w:t>
+      </w:r>
+    </w:p>
+    <w:p>
+      <w:pPr>
+        <w:ind w:left="360"/>
+      </w:pPr>
+    </w:p>
+    <w:p>
+      <w:pPr>
+        <w:pStyle w:val="ListParagraph"/>
+      </w:pPr>
+      <w:r>
+        <w:rPr>
+          <w:u w:val="single"/>
+        </w:rPr>
+        <w:t>Example 2</w:t>
+      </w:r>
+      <w:r>
+        <w:rPr>
+          <w:u w:val="single"/>
+        </w:rPr>
+        <w:t xml:space="preserve">: </w:t>
+      </w:r>
+      <w:r>
+        <w:t>this is real example from my project easy:</w:t>
+      </w:r>
+    </w:p>
+    <w:p>
+      <w:pPr>
+        <w:pStyle w:val="ListParagraph"/>
+        <w:rPr>
+          <w:i/>
+          <w:iCs/>
+        </w:rPr>
+      </w:pPr>
+      <w:r>
+        <w:rPr>
+          <w:i/>
+          <w:iCs/>
+        </w:rPr>
+        <w:t>Ground truth</w:t>
+      </w:r>
+    </w:p>
+    <w:p>
+      <w:pPr>
+        <w:pStyle w:val="ListParagraph"/>
+      </w:pPr>
+      <w:r>
+        <w:lastRenderedPageBreak/>
+        <w:t>"A navigation label starting with H must have a blue background."</w:t>
+      </w:r>
+    </w:p>
+    <w:p>
+      <w:pPr>
+        <w:pStyle w:val="ListParagraph"/>
+        <w:rPr>
+          <w:i/>
+          <w:iCs/>
+        </w:rPr>
+      </w:pPr>
+      <w:r>
+        <w:rPr>
+          <w:i/>
+          <w:iCs/>
+        </w:rPr>
+        <w:t>M</w:t>
+      </w:r>
+      <w:r>
+        <w:rPr>
+          <w:i/>
+          <w:iCs/>
+        </w:rPr>
+        <w:t xml:space="preserve">aster prompt: </w:t>
+      </w:r>
+    </w:p>
+    <w:p>
+      <w:pPr>
+        <w:pStyle w:val="ListParagraph"/>
+      </w:pPr>
+      <w:r>
+        <w:t>"A navigation label starting with H must have a red background."</w:t>
+      </w:r>
+    </w:p>
+    <w:p>
+      <w:pPr>
+        <w:pStyle w:val="ListParagraph"/>
+      </w:pPr>
+    </w:p>
+    <w:p>
+      <w:pPr>
+        <w:pStyle w:val="ListParagraph"/>
+        <w:numPr>
+          <w:ilvl w:val="0"/>
+          <w:numId w:val="9"/>
+        </w:numPr>
+      </w:pPr>
+      <w:r>
+        <w:t xml:space="preserve">It means to see if the </w:t>
+      </w:r>
+      <w:proofErr w:type="spellStart"/>
+      <w:r>
+        <w:t>BERTscore</w:t>
+      </w:r>
+      <w:proofErr w:type="spellEnd"/>
+      <w:r>
+        <w:t xml:space="preserve"> or </w:t>
+      </w:r>
+      <w:proofErr w:type="spellStart"/>
+      <w:r>
+        <w:t>Alignscore</w:t>
+      </w:r>
+      <w:proofErr w:type="spellEnd"/>
+      <w:r>
+        <w:t xml:space="preserve"> can distinct if a master prompt contradicted or completely wrong with the ground truth</w:t>
+      </w:r>
+    </w:p>
+    <w:p>
+      <w:pPr>
+        <w:pStyle w:val="ListParagraph"/>
+        <w:ind w:left="720"/>
+      </w:pPr>
+    </w:p>
+    <w:p>
+      <w:pPr>
+        <w:pStyle w:val="ListParagraph"/>
+      </w:pPr>
+      <w:r>
+        <w:rPr>
+          <w:u w:val="single"/>
+        </w:rPr>
+        <w:t xml:space="preserve">Example </w:t>
+      </w:r>
+      <w:r>
+        <w:rPr>
+          <w:u w:val="single"/>
+        </w:rPr>
+        <w:t>3</w:t>
+      </w:r>
+      <w:r>
+        <w:t xml:space="preserve">: </w:t>
+      </w:r>
+      <w:r>
+        <w:t>this</w:t>
+      </w:r>
+      <w:r>
+        <w:t xml:space="preserve"> is real example from my project hard</w:t>
+      </w:r>
+      <w:r>
+        <w:t xml:space="preserve"> compared with </w:t>
+      </w:r>
+      <w:proofErr w:type="spellStart"/>
+      <w:r>
+        <w:rPr>
+          <w:b/>
+          <w:bCs/>
+        </w:rPr>
+        <w:t>strict_Gemini</w:t>
+      </w:r>
+      <w:proofErr w:type="spellEnd"/>
+      <w:r>
+        <w:t xml:space="preserve"> output</w:t>
+      </w:r>
+    </w:p>
+    <w:p>
+      <w:pPr>
+        <w:pStyle w:val="ListParagraph"/>
+      </w:pPr>
+      <w:r>
+        <w:rPr>
+          <w:i/>
+          <w:iCs/>
+        </w:rPr>
+        <w:t>Ground</w:t>
       </w:r>
       <w:r>
         <w:t xml:space="preserve"> </w:t>
       </w:r>
       <w:r>
-        <w:t xml:space="preserve">which the </w:t>
+        <w:rPr>
+          <w:i/>
+          <w:iCs/>
+        </w:rPr>
+        <w:t>truth</w:t>
+      </w:r>
+      <w:r>
+        <w:t xml:space="preserve">: </w:t>
+      </w:r>
+    </w:p>
+    <w:p>
+      <w:pPr>
+        <w:pStyle w:val="ListParagraph"/>
+      </w:pPr>
+      <w:r>
+        <w:t xml:space="preserve">"Implement customer management with create, edit, delete, and browse operations." </w:t>
+      </w:r>
+    </w:p>
+    <w:p>
+      <w:pPr>
+        <w:pStyle w:val="ListParagraph"/>
+      </w:pPr>
+      <w:r>
+        <w:rPr>
+          <w:i/>
+          <w:iCs/>
+        </w:rPr>
+        <w:t>Master prompt:</w:t>
+      </w:r>
+      <w:r>
+        <w:t xml:space="preserve"> </w:t>
+      </w:r>
+    </w:p>
+    <w:p>
+      <w:pPr>
+        <w:pStyle w:val="ListParagraph"/>
+      </w:pPr>
+      <w:r>
+        <w:t>"Include customer management: Users can create, edit, delete, and browse customers."</w:t>
+      </w:r>
+    </w:p>
+    <w:p>
+      <w:pPr>
+        <w:pStyle w:val="ListParagraph"/>
+      </w:pPr>
+    </w:p>
+    <w:p>
+      <w:pPr>
+        <w:pStyle w:val="ListParagraph"/>
+        <w:numPr>
+          <w:ilvl w:val="0"/>
+          <w:numId w:val="9"/>
+        </w:numPr>
+      </w:pPr>
+      <w:r>
+        <w:t xml:space="preserve">It means to see in the hard project I use this output of </w:t>
       </w:r>
       <w:proofErr w:type="spellStart"/>
       <w:r>
-        <w:t>BERTScore</w:t>
+        <w:rPr>
+          <w:b/>
+          <w:bCs/>
+        </w:rPr>
+        <w:t>strict_consolidate_Gemini</w:t>
       </w:r>
       <w:proofErr w:type="spellEnd"/>
       <w:r>
-        <w:t xml:space="preserve"> paper reports as the strongest backbone for English. Two limitations make it secondary: (1) it caps at 512 tokens, so long prompts are truncated and their scores become unreliable; (2) it measures similarity only - it cannot tell a paraphrase from a contradiction.</w:t>
-      </w:r>
-    </w:p>
-    <w:p>
-      <w:pPr>
-        <w:pStyle w:val="Heading2"/>
-      </w:pPr>
-      <w:r>
-        <w:t>AlignScore - faithfulness / entailment (primary)</w:t>
-      </w:r>
-    </w:p>
-    <w:p>
-      <w:r>
-        <w:t>AlignScore is a learned metric, not a similarity formula. It feeds the context and the claim into a RoBERTa model together and predicts whether the claim is supported by the context (entailment). The checkpoint was fine-tuned on 4.7M examples across NLI, QA, fact verification, paraphrase and summarization, so it has learned what 'supported by' means. It splits the context into ~350-word chunks and the claim into sentences, so it scores long prompts in full with no truncation. The score is in [0,1].</w:t>
-      </w:r>
-    </w:p>
-    <w:p>
-      <w:r>
-        <w:t>It is directional, so each candidate is scored twice:</w:t>
-      </w:r>
-    </w:p>
-    <w:p>
-      <w:r>
-        <w:t xml:space="preserve">  - precision = ALIGN(context = ground truth, claim = candidate): is the candidate's content supported by the ground truth? Low = fabricated / non-traceable content.</w:t>
-      </w:r>
-    </w:p>
-    <w:p>
-      <w:r>
-        <w:t xml:space="preserve">  - recall = ALIGN(context = candidate, claim = ground truth): is each ground-truth requirement supported by the candidate? Low = dropped requirement.</w:t>
-      </w:r>
-    </w:p>
-    <w:p>
-      <w:r>
-        <w:t>It uses RoBERTa (not DeBERTa) because it is a fine-tuned classifier, not frozen embeddings: the released checkpoint is a fine-tuned RoBERTa, and the value is in the 4.7M-example training, not the raw encoder.</w:t>
-      </w:r>
-    </w:p>
-    <w:p>
-      <w:pPr>
-        <w:pStyle w:val="Heading2"/>
-      </w:pPr>
-      <w:r>
-        <w:t xml:space="preserve">Experiment I do for both </w:t>
+        <w:t xml:space="preserve"> to compare with the </w:t>
+      </w:r>
+      <w:r>
+        <w:rPr>
+          <w:b/>
+          <w:bCs/>
+        </w:rPr>
+        <w:t>ground truth</w:t>
+      </w:r>
+      <w:r>
+        <w:t>. As you can see, the master prompt should be good because it state</w:t>
+      </w:r>
+      <w:r>
+        <w:t>d</w:t>
+      </w:r>
+      <w:r>
+        <w:t xml:space="preserve"> correctly about 4 function</w:t>
+      </w:r>
+      <w:r>
+        <w:t>s</w:t>
+      </w:r>
+      <w:r>
+        <w:t xml:space="preserve"> create, edit, delete, browse without adding non sense things. So that </w:t>
+      </w:r>
+      <w:r>
+        <w:t>I expected this requirement to meet about 90% of the ground truth</w:t>
+      </w:r>
+      <w:r>
+        <w:t>. However</w:t>
+      </w:r>
+      <w:r>
+        <w:t xml:space="preserve">, </w:t>
+      </w:r>
+      <w:r>
+        <w:t xml:space="preserve">the result of </w:t>
       </w:r>
       <w:proofErr w:type="spellStart"/>
       <w:r>
+        <w:t>Bertscore</w:t>
+      </w:r>
+      <w:proofErr w:type="spellEnd"/>
+      <w:r>
+        <w:t xml:space="preserve"> Precision</w:t>
+      </w:r>
+      <w:r>
+        <w:t xml:space="preserve"> 0.63</w:t>
+      </w:r>
+      <w:r>
+        <w:t xml:space="preserve">, meanwhile </w:t>
+      </w:r>
+      <w:r>
+        <w:t>Align Precision</w:t>
+      </w:r>
+      <w:r>
+        <w:t xml:space="preserve"> </w:t>
+      </w:r>
+      <w:r>
+        <w:t xml:space="preserve">0.87 which indicate </w:t>
+      </w:r>
+      <w:proofErr w:type="spellStart"/>
+      <w:r>
+        <w:t>Alignscore</w:t>
+      </w:r>
+      <w:proofErr w:type="spellEnd"/>
+      <w:r>
+        <w:t xml:space="preserve"> can get the requirement better than </w:t>
+      </w:r>
+      <w:proofErr w:type="spellStart"/>
+      <w:r>
         <w:t>BERTscore</w:t>
       </w:r>
       <w:proofErr w:type="spellEnd"/>
       <w:r>
-        <w:t xml:space="preserve"> and </w:t>
-      </w:r>
-      <w:proofErr w:type="spellStart"/>
-      <w:r>
-        <w:t>Alignscore</w:t>
-      </w:r>
-      <w:proofErr w:type="spellEnd"/>
-      <w:r>
-        <w:t xml:space="preserve"> </w:t>
-      </w:r>
-    </w:p>
-    <w:p>
-      <w:r>
-        <w:t>Three sentence pairs scored by both metrics. The contradiction (blue vs red) scores higher on BERTScore than the honest paraphrase - proof that similarity does not equal faithfulness. AlignScore is correct on both.</w:t>
-      </w:r>
+        <w:t>.</w:t>
+      </w:r>
+    </w:p>
+    <w:p/>
+    <w:p>
+      <w:pPr>
+        <w:pStyle w:val="ListParagraph"/>
+        <w:ind w:left="720"/>
+      </w:pPr>
     </w:p>
     <w:tbl>
       <w:tblPr>
@@ -8251,13 +9174,17 @@
         <w:tblLook w:val="04A0" w:firstRow="1" w:lastRow="0" w:firstColumn="1" w:lastColumn="0" w:noHBand="0" w:noVBand="1"/>
       </w:tblPr>
       <w:tblGrid>
-        <w:gridCol w:w="1870"/>
-        <w:gridCol w:w="1870"/>
-        <w:gridCol w:w="1870"/>
-        <w:gridCol w:w="1870"/>
-        <w:gridCol w:w="1870"/>
+        <w:gridCol w:w="1872"/>
+        <w:gridCol w:w="1475"/>
+        <w:gridCol w:w="1476"/>
+        <w:gridCol w:w="1476"/>
+        <w:gridCol w:w="1486"/>
+        <w:gridCol w:w="1486"/>
       </w:tblGrid>
       <w:tr>
+        <w:trPr>
+          <w:trHeight w:val="362"/>
+        </w:trPr>
         <w:tc>
           <w:tcPr>
             <w:tcW w:w="1872" w:type="dxa"/>
@@ -8273,71 +9200,107 @@
         </w:tc>
         <w:tc>
           <w:tcPr>
-            <w:tcW w:w="1872" w:type="dxa"/>
+            <w:tcW w:w="1475" w:type="dxa"/>
           </w:tcPr>
           <w:p>
             <w:r>
               <w:rPr>
                 <w:b/>
               </w:rPr>
-              <w:t>BERTScore F1</w:t>
-            </w:r>
-          </w:p>
-        </w:tc>
-        <w:tc>
-          <w:tcPr>
-            <w:tcW w:w="1872" w:type="dxa"/>
+              <w:t>BERT P</w:t>
+            </w:r>
+          </w:p>
+        </w:tc>
+        <w:tc>
+          <w:tcPr>
+            <w:tcW w:w="1476" w:type="dxa"/>
           </w:tcPr>
           <w:p>
             <w:r>
               <w:rPr>
                 <w:b/>
               </w:rPr>
-              <w:t>AlignScore P</w:t>
-            </w:r>
-          </w:p>
-        </w:tc>
-        <w:tc>
-          <w:tcPr>
-            <w:tcW w:w="1872" w:type="dxa"/>
+              <w:t>BERT R</w:t>
+            </w:r>
+          </w:p>
+        </w:tc>
+        <w:tc>
+          <w:tcPr>
+            <w:tcW w:w="1476" w:type="dxa"/>
           </w:tcPr>
           <w:p>
             <w:r>
               <w:rPr>
                 <w:b/>
               </w:rPr>
-              <w:t>AlignScore R</w:t>
-            </w:r>
-          </w:p>
-        </w:tc>
-        <w:tc>
-          <w:tcPr>
-            <w:tcW w:w="1872" w:type="dxa"/>
+              <w:t>BERT F1</w:t>
+            </w:r>
+          </w:p>
+        </w:tc>
+        <w:tc>
+          <w:tcPr>
+            <w:tcW w:w="1486" w:type="dxa"/>
           </w:tcPr>
           <w:p>
             <w:r>
               <w:rPr>
                 <w:b/>
               </w:rPr>
-              <w:t>What it shows</w:t>
+              <w:t>Align P</w:t>
+            </w:r>
+          </w:p>
+        </w:tc>
+        <w:tc>
+          <w:tcPr>
+            <w:tcW w:w="1486" w:type="dxa"/>
+          </w:tcPr>
+          <w:p>
+            <w:r>
+              <w:rPr>
+                <w:b/>
+              </w:rPr>
+              <w:t>Align R</w:t>
             </w:r>
           </w:p>
         </w:tc>
       </w:tr>
       <w:tr>
+        <w:trPr>
+          <w:trHeight w:val="745"/>
+        </w:trPr>
         <w:tc>
           <w:tcPr>
             <w:tcW w:w="1872" w:type="dxa"/>
           </w:tcPr>
           <w:p>
             <w:r>
-              <w:t>"cold" vs "freezing" (paraphrase)</w:t>
-            </w:r>
-          </w:p>
-        </w:tc>
-        <w:tc>
-          <w:tcPr>
-            <w:tcW w:w="1872" w:type="dxa"/>
+              <w:t>Example 1 (paraphrase)</w:t>
+            </w:r>
+          </w:p>
+        </w:tc>
+        <w:tc>
+          <w:tcPr>
+            <w:tcW w:w="1475" w:type="dxa"/>
+          </w:tcPr>
+          <w:p>
+            <w:r>
+              <w:t>0.87</w:t>
+            </w:r>
+          </w:p>
+        </w:tc>
+        <w:tc>
+          <w:tcPr>
+            <w:tcW w:w="1476" w:type="dxa"/>
+          </w:tcPr>
+          <w:p>
+            <w:r>
+              <w:t>0.75</w:t>
+            </w:r>
+          </w:p>
+        </w:tc>
+        <w:tc>
+          <w:tcPr>
+            <w:tcW w:w="1476" w:type="dxa"/>
           </w:tcPr>
           <w:p>
             <w:r>
@@ -8347,49 +9310,42 @@
         </w:tc>
         <w:tc>
           <w:tcPr>
-            <w:tcW w:w="1872" w:type="dxa"/>
-          </w:tcPr>
-          <w:p>
-            <w:r>
-              <w:t>0.96</w:t>
-            </w:r>
-          </w:p>
-        </w:tc>
-        <w:tc>
-          <w:tcPr>
-            <w:tcW w:w="1872" w:type="dxa"/>
+            <w:tcW w:w="1486" w:type="dxa"/>
+          </w:tcPr>
+          <w:p>
+            <w:r>
+              <w:t>0.84</w:t>
+            </w:r>
+          </w:p>
+        </w:tc>
+        <w:tc>
+          <w:tcPr>
+            <w:tcW w:w="1486" w:type="dxa"/>
           </w:tcPr>
           <w:p>
             <w:r>
               <w:t>0.99</w:t>
-            </w:r>
-          </w:p>
-        </w:tc>
-        <w:tc>
-          <w:tcPr>
-            <w:tcW w:w="1872" w:type="dxa"/>
-          </w:tcPr>
-          <w:p>
-            <w:r>
-              <w:t>both credit paraphrase - correct</w:t>
             </w:r>
           </w:p>
         </w:tc>
       </w:tr>
       <w:tr>
+        <w:trPr>
+          <w:trHeight w:val="745"/>
+        </w:trPr>
         <w:tc>
           <w:tcPr>
             <w:tcW w:w="1872" w:type="dxa"/>
           </w:tcPr>
           <w:p>
             <w:r>
-              <w:t>H -&gt; blue vs H -&gt; red (contradiction)</w:t>
-            </w:r>
-          </w:p>
-        </w:tc>
-        <w:tc>
-          <w:tcPr>
-            <w:tcW w:w="1872" w:type="dxa"/>
+              <w:t>Example 2 (contradiction)</w:t>
+            </w:r>
+          </w:p>
+        </w:tc>
+        <w:tc>
+          <w:tcPr>
+            <w:tcW w:w="1475" w:type="dxa"/>
           </w:tcPr>
           <w:p>
             <w:r>
@@ -8399,55 +9355,82 @@
         </w:tc>
         <w:tc>
           <w:tcPr>
-            <w:tcW w:w="1872" w:type="dxa"/>
+            <w:tcW w:w="1476" w:type="dxa"/>
+          </w:tcPr>
+          <w:p>
+            <w:r>
+              <w:t>0.98</w:t>
+            </w:r>
+          </w:p>
+        </w:tc>
+        <w:tc>
+          <w:tcPr>
+            <w:tcW w:w="1476" w:type="dxa"/>
+          </w:tcPr>
+          <w:p>
+            <w:r>
+              <w:t>0.98</w:t>
+            </w:r>
+          </w:p>
+        </w:tc>
+        <w:tc>
+          <w:tcPr>
+            <w:tcW w:w="1486" w:type="dxa"/>
+          </w:tcPr>
+          <w:p>
+            <w:r>
+              <w:t>0.0002</w:t>
+            </w:r>
+          </w:p>
+        </w:tc>
+        <w:tc>
+          <w:tcPr>
+            <w:tcW w:w="1486" w:type="dxa"/>
           </w:tcPr>
           <w:p>
             <w:r>
               <w:t>0.0003</w:t>
-            </w:r>
-          </w:p>
-        </w:tc>
-        <w:tc>
-          <w:tcPr>
-            <w:tcW w:w="1872" w:type="dxa"/>
-          </w:tcPr>
-          <w:p>
-            <w:r>
-              <w:t>0.0003</w:t>
-            </w:r>
-          </w:p>
-        </w:tc>
-        <w:tc>
-          <w:tcPr>
-            <w:tcW w:w="1872" w:type="dxa"/>
-          </w:tcPr>
-          <w:p>
-            <w:r>
-              <w:t>BERTScore fooled; AlignScore catches it</w:t>
             </w:r>
           </w:p>
         </w:tc>
       </w:tr>
       <w:tr>
+        <w:trPr>
+          <w:trHeight w:val="1126"/>
+        </w:trPr>
         <w:tc>
           <w:tcPr>
             <w:tcW w:w="1872" w:type="dxa"/>
           </w:tcPr>
           <w:p>
             <w:r>
-              <w:t xml:space="preserve">customer </w:t>
-            </w:r>
-            <w:r>
-              <w:t>management</w:t>
-            </w:r>
-            <w:r>
-              <w:t xml:space="preserve"> </w:t>
-            </w:r>
-          </w:p>
-        </w:tc>
-        <w:tc>
-          <w:tcPr>
-            <w:tcW w:w="1872" w:type="dxa"/>
+              <w:t>Example 3 (real paraphrase)</w:t>
+            </w:r>
+          </w:p>
+        </w:tc>
+        <w:tc>
+          <w:tcPr>
+            <w:tcW w:w="1475" w:type="dxa"/>
+          </w:tcPr>
+          <w:p>
+            <w:r>
+              <w:t>0.63</w:t>
+            </w:r>
+          </w:p>
+        </w:tc>
+        <w:tc>
+          <w:tcPr>
+            <w:tcW w:w="1476" w:type="dxa"/>
+          </w:tcPr>
+          <w:p>
+            <w:r>
+              <w:t>0.68</w:t>
+            </w:r>
+          </w:p>
+        </w:tc>
+        <w:tc>
+          <w:tcPr>
+            <w:tcW w:w="1476" w:type="dxa"/>
           </w:tcPr>
           <w:p>
             <w:r>
@@ -8457,31 +9440,21 @@
         </w:tc>
         <w:tc>
           <w:tcPr>
-            <w:tcW w:w="1872" w:type="dxa"/>
-          </w:tcPr>
-          <w:p>
-            <w:r>
-              <w:t>0.86</w:t>
-            </w:r>
-          </w:p>
-        </w:tc>
-        <w:tc>
-          <w:tcPr>
-            <w:tcW w:w="1872" w:type="dxa"/>
-          </w:tcPr>
-          <w:p>
-            <w:r>
-              <w:t>0.91</w:t>
-            </w:r>
-          </w:p>
-        </w:tc>
-        <w:tc>
-          <w:tcPr>
-            <w:tcW w:w="1872" w:type="dxa"/>
-          </w:tcPr>
-          <w:p>
-            <w:r>
-              <w:t>BERTScore under-scores honest rewording</w:t>
+            <w:tcW w:w="1486" w:type="dxa"/>
+          </w:tcPr>
+          <w:p>
+            <w:r>
+              <w:t>0.87</w:t>
+            </w:r>
+          </w:p>
+        </w:tc>
+        <w:tc>
+          <w:tcPr>
+            <w:tcW w:w="1486" w:type="dxa"/>
+          </w:tcPr>
+          <w:p>
+            <w:r>
+              <w:t>0.97</w:t>
             </w:r>
           </w:p>
         </w:tc>
@@ -8489,17 +9462,558 @@
     </w:tbl>
     <w:p>
       <w:pPr>
-        <w:pStyle w:val="Heading2"/>
-      </w:pPr>
-      <w:r>
+        <w:pStyle w:val="ListParagraph"/>
+        <w:rPr>
+          <w:b/>
+          <w:bCs/>
+        </w:rPr>
+      </w:pPr>
+    </w:p>
+    <w:p>
+      <w:pPr>
+        <w:pStyle w:val="ListParagraph"/>
+      </w:pPr>
+      <w:r>
+        <w:rPr>
+          <w:b/>
+          <w:bCs/>
+        </w:rPr>
+        <w:t>BERT precision</w:t>
+      </w:r>
+      <w:r>
+        <w:t xml:space="preserve"> = how much of the master prompt's meaning is found in the ground truth</w:t>
+      </w:r>
+      <w:r>
+        <w:t xml:space="preserve"> (in term of cosine similarity in vector representation)</w:t>
+      </w:r>
+    </w:p>
+    <w:p>
+      <w:pPr>
+        <w:pStyle w:val="ListParagraph"/>
+      </w:pPr>
+      <w:r>
+        <w:rPr>
+          <w:b/>
+          <w:bCs/>
+        </w:rPr>
+        <w:t>BERT recall</w:t>
+      </w:r>
+      <w:r>
+        <w:t xml:space="preserve"> = how much master prompt</w:t>
+      </w:r>
+      <w:r>
+        <w:t xml:space="preserve"> preserve the requirements from ground truth</w:t>
+      </w:r>
+    </w:p>
+    <w:p>
+      <w:pPr>
+        <w:pStyle w:val="ListParagraph"/>
+      </w:pPr>
+      <w:r>
+        <w:rPr>
+          <w:b/>
+          <w:bCs/>
+        </w:rPr>
+        <w:t>BERT F1</w:t>
+      </w:r>
+      <w:r>
+        <w:t xml:space="preserve"> = the mean of the two.</w:t>
+      </w:r>
+    </w:p>
+    <w:p>
+      <w:pPr>
+        <w:pStyle w:val="ListParagraph"/>
+      </w:pPr>
+      <w:r>
+        <w:rPr>
+          <w:b/>
+          <w:bCs/>
+        </w:rPr>
+        <w:t>Align Precision</w:t>
+      </w:r>
+      <w:r>
+        <w:t>: Measures whether the master prompt is fully supported by the ground truth. Low values indicate added or hallucinated requirements</w:t>
+      </w:r>
+      <w:r>
+        <w:t xml:space="preserve"> (in term of traceability)</w:t>
+      </w:r>
+    </w:p>
+    <w:p>
+      <w:pPr>
+        <w:pStyle w:val="ListParagraph"/>
+      </w:pPr>
+      <w:r>
+        <w:rPr>
+          <w:b/>
+          <w:bCs/>
+        </w:rPr>
+        <w:t>Align Recall</w:t>
+      </w:r>
+      <w:r>
+        <w:t xml:space="preserve">: Measures whether the master prompt preserves the requirements from the ground truth. Low values indicate omitted or </w:t>
+      </w:r>
+      <w:r>
+        <w:t>missing</w:t>
+      </w:r>
+      <w:r>
+        <w:t xml:space="preserve"> requirements.</w:t>
+      </w:r>
+    </w:p>
+    <w:p>
+      <w:pPr>
+        <w:pStyle w:val="ListParagraph"/>
+      </w:pPr>
+    </w:p>
+    <w:p>
+      <w:pPr>
+        <w:pStyle w:val="ListParagraph"/>
+        <w:numPr>
+          <w:ilvl w:val="0"/>
+          <w:numId w:val="9"/>
+        </w:numPr>
+      </w:pPr>
+      <w:r>
+        <w:t xml:space="preserve">Anyway, these two metrics still have a severe problem which is the way both </w:t>
+      </w:r>
+      <w:proofErr w:type="spellStart"/>
+      <w:r>
+        <w:t>Alignscore</w:t>
+      </w:r>
+      <w:proofErr w:type="spellEnd"/>
+      <w:r>
+        <w:t xml:space="preserve"> and </w:t>
+      </w:r>
+      <w:proofErr w:type="spellStart"/>
+      <w:r>
+        <w:t>Bertscore</w:t>
+      </w:r>
+      <w:proofErr w:type="spellEnd"/>
+      <w:r>
+        <w:t xml:space="preserve"> split the requirement to measure precision/recall is:</w:t>
+      </w:r>
+    </w:p>
+    <w:p>
+      <w:pPr>
+        <w:pStyle w:val="ListParagraph"/>
+        <w:ind w:left="720"/>
+      </w:pPr>
+      <w:r>
+        <w:br/>
+      </w:r>
+      <w:proofErr w:type="spellStart"/>
+      <w:r>
+        <w:rPr>
+          <w:b/>
+          <w:bCs/>
+        </w:rPr>
+        <w:t>BERTScore</w:t>
+      </w:r>
+      <w:proofErr w:type="spellEnd"/>
+      <w:r>
+        <w:t xml:space="preserve"> splits both texts into sub-word </w:t>
+      </w:r>
+      <w:r>
+        <w:t xml:space="preserve">BPE </w:t>
+      </w:r>
+      <w:r>
+        <w:t>tokens and matches token to token, so it has no idea where a requirement starts or ends.</w:t>
+      </w:r>
+    </w:p>
+    <w:p>
+      <w:pPr>
+        <w:pStyle w:val="ListParagraph"/>
+        <w:ind w:left="720"/>
+      </w:pPr>
+      <w:proofErr w:type="spellStart"/>
+      <w:r>
+        <w:rPr>
+          <w:b/>
+          <w:bCs/>
+        </w:rPr>
+        <w:t>AlignScore</w:t>
+      </w:r>
+      <w:proofErr w:type="spellEnd"/>
+      <w:r>
+        <w:t xml:space="preserve"> splits the </w:t>
+      </w:r>
+      <w:r>
+        <w:t>ground truth</w:t>
+      </w:r>
+      <w:r>
+        <w:t xml:space="preserve"> into ~350-token chunks and the </w:t>
+      </w:r>
+      <w:r>
+        <w:t xml:space="preserve">master prompt </w:t>
+      </w:r>
+      <w:r>
+        <w:t xml:space="preserve">into </w:t>
+      </w:r>
+      <w:r>
+        <w:t xml:space="preserve">individual </w:t>
+      </w:r>
+      <w:r>
+        <w:t>sentences, which is still</w:t>
+      </w:r>
+      <w:r>
+        <w:t xml:space="preserve"> shorter/ longer </w:t>
+      </w:r>
+      <w:r>
+        <w:t>than one requirement.</w:t>
+      </w:r>
+    </w:p>
+    <w:p>
+      <w:pPr>
+        <w:pStyle w:val="ListParagraph"/>
+        <w:ind w:left="720"/>
+      </w:pPr>
+    </w:p>
+    <w:p>
+      <w:pPr>
+        <w:pStyle w:val="ListParagraph"/>
+        <w:numPr>
+          <w:ilvl w:val="0"/>
+          <w:numId w:val="9"/>
+        </w:numPr>
+        <w:rPr>
+          <w:b/>
+          <w:bCs/>
+        </w:rPr>
+      </w:pPr>
+      <w:r>
+        <w:rPr>
+          <w:b/>
+          <w:bCs/>
+        </w:rPr>
+        <w:lastRenderedPageBreak/>
+        <w:t>This is why I need a more reliable way to measure with a more standard splitting: first cut each master prompt and ground truth into individual requirements, and only then measure precision (traceability) and recall (prompt loss) on those units</w:t>
+      </w:r>
+    </w:p>
+    <w:p>
+      <w:pPr>
+        <w:pStyle w:val="ListParagraph"/>
+        <w:numPr>
+          <w:ilvl w:val="0"/>
+          <w:numId w:val="9"/>
+        </w:numPr>
+        <w:rPr>
+          <w:b/>
+          <w:bCs/>
+        </w:rPr>
+      </w:pPr>
+      <w:r>
+        <w:rPr>
+          <w:b/>
+          <w:bCs/>
+        </w:rPr>
+        <w:t>That’s is why I need you help on generat</w:t>
+      </w:r>
+      <w:r>
+        <w:rPr>
+          <w:b/>
+          <w:bCs/>
+        </w:rPr>
+        <w:t>ing</w:t>
+      </w:r>
+      <w:r>
+        <w:rPr>
+          <w:b/>
+          <w:bCs/>
+        </w:rPr>
+        <w:t xml:space="preserve"> the better ground truth because the last time you saw my ground truth, you asked me about the non-business requirement (clean the code and refactor…), so I will need the help from you to form a better ground truth for that project. Besides, </w:t>
+      </w:r>
+      <w:r>
+        <w:rPr>
+          <w:b/>
+          <w:bCs/>
+        </w:rPr>
+        <w:t>I need some help on judging the output master prompt of all 3 models. What I mean is that you can look at the output and mark the part where it is traceable to the ground truth, and non-traceable to the ground truth.</w:t>
+      </w:r>
+      <w:r>
+        <w:rPr>
+          <w:b/>
+          <w:bCs/>
+        </w:rPr>
+        <w:br/>
+      </w:r>
+    </w:p>
+    <w:p>
+      <w:pPr>
+        <w:pStyle w:val="ListParagraph"/>
+        <w:numPr>
+          <w:ilvl w:val="0"/>
+          <w:numId w:val="9"/>
+        </w:numPr>
+      </w:pPr>
+      <w:r>
+        <w:rPr>
+          <w:b/>
+          <w:bCs/>
+        </w:rPr>
+        <w:t xml:space="preserve">Also, I want to ask about the recall, from the last time we talked, I believe you think the recall percentage is </w:t>
+      </w:r>
+      <w:r>
+        <w:rPr>
+          <w:b/>
+          <w:bCs/>
+        </w:rPr>
+        <w:t xml:space="preserve">not </w:t>
+      </w:r>
+      <w:r>
+        <w:rPr>
+          <w:b/>
+          <w:bCs/>
+        </w:rPr>
+        <w:t>necessary. However, I’m afraid that if we only use precision to measure the correctness of master prompt</w:t>
+      </w:r>
+      <w:r>
+        <w:rPr>
+          <w:b/>
+          <w:bCs/>
+        </w:rPr>
+        <w:t xml:space="preserve"> and skip the recall. I’m afraid that the master prompt can have missing requirement compare with ground truth</w:t>
+      </w:r>
+      <w:r>
+        <w:rPr>
+          <w:b/>
+          <w:bCs/>
+          <w:lang w:val="vi-VN"/>
+        </w:rPr>
+        <w:t xml:space="preserve"> so that I keep it</w:t>
+      </w:r>
+      <w:r>
+        <w:rPr>
+          <w:b/>
+          <w:bCs/>
+        </w:rPr>
+        <w:t>. For example</w:t>
+      </w:r>
+      <w:r>
+        <w:rPr>
+          <w:b/>
+          <w:bCs/>
+          <w:lang w:val="vi-VN"/>
+        </w:rPr>
+        <w:t>:</w:t>
+      </w:r>
+    </w:p>
+    <w:p>
+      <w:pPr>
+        <w:pStyle w:val="ListParagraph"/>
+        <w:ind w:left="720"/>
+        <w:rPr>
+          <w:lang w:val="vi-VN"/>
+        </w:rPr>
+      </w:pPr>
+    </w:p>
+    <w:p>
+      <w:pPr>
+        <w:pStyle w:val="ListParagraph"/>
+        <w:ind w:left="720"/>
+        <w:rPr>
+          <w:lang w:val="vi-VN"/>
+        </w:rPr>
+      </w:pPr>
+      <w:r>
+        <w:rPr>
+          <w:noProof/>
+        </w:rPr>
+        <w:drawing>
+          <wp:anchor distT="0" distB="0" distL="114300" distR="114300" simplePos="0" relativeHeight="251663360" behindDoc="0" locked="0" layoutInCell="1" allowOverlap="1" wp14:anchorId="369889E8" wp14:editId="466B208E">
+            <wp:simplePos x="0" y="0"/>
+            <wp:positionH relativeFrom="column">
+              <wp:posOffset>15240</wp:posOffset>
+            </wp:positionH>
+            <wp:positionV relativeFrom="paragraph">
+              <wp:posOffset>221726</wp:posOffset>
+            </wp:positionV>
+            <wp:extent cx="5943600" cy="1373505"/>
+            <wp:effectExtent l="0" t="0" r="0" b="0"/>
+            <wp:wrapTopAndBottom/>
+            <wp:docPr id="1606159332" name="Picture 1"/>
+            <wp:cNvGraphicFramePr>
+              <a:graphicFrameLocks xmlns:a="http://schemas.openxmlformats.org/drawingml/2006/main" noChangeAspect="1"/>
+            </wp:cNvGraphicFramePr>
+            <a:graphic xmlns:a="http://schemas.openxmlformats.org/drawingml/2006/main">
+              <a:graphicData uri="http://schemas.openxmlformats.org/drawingml/2006/picture">
+                <pic:pic xmlns:pic="http://schemas.openxmlformats.org/drawingml/2006/picture">
+                  <pic:nvPicPr>
+                    <pic:cNvPr id="1606159332" name=""/>
+                    <pic:cNvPicPr/>
+                  </pic:nvPicPr>
+                  <pic:blipFill>
+                    <a:blip r:embed="rId28">
+                      <a:extLst>
+                        <a:ext uri="{28A0092B-C50C-407E-A947-70E740481C1C}">
+                          <a14:useLocalDpi xmlns:a14="http://schemas.microsoft.com/office/drawing/2010/main" val="0"/>
+                        </a:ext>
+                      </a:extLst>
+                    </a:blip>
+                    <a:stretch>
+                      <a:fillRect/>
+                    </a:stretch>
+                  </pic:blipFill>
+                  <pic:spPr>
+                    <a:xfrm>
+                      <a:off x="0" y="0"/>
+                      <a:ext cx="5943600" cy="1373505"/>
+                    </a:xfrm>
+                    <a:prstGeom prst="rect">
+                      <a:avLst/>
+                    </a:prstGeom>
+                  </pic:spPr>
+                </pic:pic>
+              </a:graphicData>
+            </a:graphic>
+            <wp14:sizeRelH relativeFrom="page">
+              <wp14:pctWidth>0</wp14:pctWidth>
+            </wp14:sizeRelH>
+            <wp14:sizeRelV relativeFrom="page">
+              <wp14:pctHeight>0</wp14:pctHeight>
+            </wp14:sizeRelV>
+          </wp:anchor>
+        </w:drawing>
+      </w:r>
+      <w:r>
+        <w:rPr>
+          <w:lang w:val="vi-VN"/>
+        </w:rPr>
+        <w:t>master prompt from gemini strict consolidate:</w:t>
+      </w:r>
+      <w:r>
+        <w:rPr>
+          <w:b/>
+          <w:bCs/>
+          <w:lang w:val="vi-VN"/>
+        </w:rPr>
+        <w:br/>
+      </w:r>
+    </w:p>
+    <w:p>
+      <w:pPr>
+        <w:pStyle w:val="ListParagraph"/>
+        <w:ind w:left="720"/>
+        <w:rPr>
+          <w:lang w:val="vi-VN"/>
+        </w:rPr>
+      </w:pPr>
+      <w:r>
+        <w:rPr>
+          <w:noProof/>
+        </w:rPr>
+        <w:drawing>
+          <wp:anchor distT="0" distB="0" distL="114300" distR="114300" simplePos="0" relativeHeight="251664384" behindDoc="0" locked="0" layoutInCell="1" allowOverlap="1" wp14:anchorId="2A008865" wp14:editId="2A0E2EDA">
+            <wp:simplePos x="0" y="0"/>
+            <wp:positionH relativeFrom="column">
+              <wp:posOffset>15240</wp:posOffset>
+            </wp:positionH>
+            <wp:positionV relativeFrom="paragraph">
+              <wp:posOffset>293922</wp:posOffset>
+            </wp:positionV>
+            <wp:extent cx="5943600" cy="1057910"/>
+            <wp:effectExtent l="0" t="0" r="0" b="8890"/>
+            <wp:wrapTopAndBottom/>
+            <wp:docPr id="1964494933" name="Picture 1"/>
+            <wp:cNvGraphicFramePr>
+              <a:graphicFrameLocks xmlns:a="http://schemas.openxmlformats.org/drawingml/2006/main" noChangeAspect="1"/>
+            </wp:cNvGraphicFramePr>
+            <a:graphic xmlns:a="http://schemas.openxmlformats.org/drawingml/2006/main">
+              <a:graphicData uri="http://schemas.openxmlformats.org/drawingml/2006/picture">
+                <pic:pic xmlns:pic="http://schemas.openxmlformats.org/drawingml/2006/picture">
+                  <pic:nvPicPr>
+                    <pic:cNvPr id="1964494933" name=""/>
+                    <pic:cNvPicPr/>
+                  </pic:nvPicPr>
+                  <pic:blipFill>
+                    <a:blip r:embed="rId29" cstate="print">
+                      <a:extLst>
+                        <a:ext uri="{28A0092B-C50C-407E-A947-70E740481C1C}">
+                          <a14:useLocalDpi xmlns:a14="http://schemas.microsoft.com/office/drawing/2010/main" val="0"/>
+                        </a:ext>
+                      </a:extLst>
+                    </a:blip>
+                    <a:stretch>
+                      <a:fillRect/>
+                    </a:stretch>
+                  </pic:blipFill>
+                  <pic:spPr>
+                    <a:xfrm>
+                      <a:off x="0" y="0"/>
+                      <a:ext cx="5943600" cy="1057910"/>
+                    </a:xfrm>
+                    <a:prstGeom prst="rect">
+                      <a:avLst/>
+                    </a:prstGeom>
+                  </pic:spPr>
+                </pic:pic>
+              </a:graphicData>
+            </a:graphic>
+            <wp14:sizeRelH relativeFrom="page">
+              <wp14:pctWidth>0</wp14:pctWidth>
+            </wp14:sizeRelH>
+            <wp14:sizeRelV relativeFrom="page">
+              <wp14:pctHeight>0</wp14:pctHeight>
+            </wp14:sizeRelV>
+          </wp:anchor>
+        </w:drawing>
+      </w:r>
+      <w:r>
+        <w:rPr>
+          <w:lang w:val="vi-VN"/>
+        </w:rPr>
+        <w:t>ground truth:</w:t>
+      </w:r>
+    </w:p>
+    <w:p>
+      <w:pPr>
+        <w:pStyle w:val="ListParagraph"/>
+        <w:ind w:left="720"/>
+        <w:rPr>
+          <w:lang w:val="vi-VN"/>
+        </w:rPr>
+      </w:pPr>
+    </w:p>
+    <w:p>
+      <w:pPr>
+        <w:pStyle w:val="ListParagraph"/>
+        <w:ind w:left="720"/>
+        <w:rPr>
+          <w:b/>
+          <w:bCs/>
+          <w:lang w:val="vi-VN"/>
+        </w:rPr>
+      </w:pPr>
+      <w:r>
+        <w:rPr>
+          <w:b/>
+          <w:bCs/>
+          <w:lang w:val="vi-VN"/>
+        </w:rPr>
+        <w:t>I created the first requirement “create a simple ERP web application for a small business with a clean foundation that can be gradually expanded” but in the gemini master prompt it skip completely my first requirement so there is a lost in it</w:t>
+      </w:r>
+    </w:p>
+    <w:p>
+      <w:r>
+        <w:br w:type="page"/>
+      </w:r>
+    </w:p>
+    <w:p>
+      <w:pPr>
+        <w:pStyle w:val="ListParagraph"/>
+      </w:pPr>
+      <w:r>
+        <w:lastRenderedPageBreak/>
         <w:t>Full results - 18 candidates</w:t>
       </w:r>
     </w:p>
     <w:p>
       <w:r>
-        <w:t>Each candidate master prompt scored against its project ground truth. AlignScore P/R in [0,1] (raw); BERTScore P/R/F1 baseline-rescaled. Rows marked * have a candidate longer than 512 tokens, so the BERTScore columns are computed on truncated text; AlignScore scores them in full.</w:t>
-      </w:r>
-    </w:p>
+        <w:t xml:space="preserve">Then I run both metrics on all 18 master prompts </w:t>
+      </w:r>
+      <w:r>
+        <w:t xml:space="preserve">(3 models x 3 prompt types x 2 projects) </w:t>
+      </w:r>
+    </w:p>
+    <w:p/>
     <w:tbl>
       <w:tblPr>
         <w:tblW w:w="0" w:type="auto"/>
@@ -8532,7 +10046,6 @@
               <w:rPr>
                 <w:b/>
               </w:rPr>
-              <w:lastRenderedPageBreak/>
               <w:t>Project</w:t>
             </w:r>
           </w:p>
@@ -8622,9 +10135,11 @@
             <w:tcW w:w="1337" w:type="dxa"/>
           </w:tcPr>
           <w:p>
+            <w:proofErr w:type="spellStart"/>
             <w:r>
               <w:t>hard_erp</w:t>
             </w:r>
+            <w:proofErr w:type="spellEnd"/>
           </w:p>
         </w:tc>
         <w:tc>
@@ -8643,7 +10158,7 @@
           </w:tcPr>
           <w:p>
             <w:r>
-              <w:t>0.340</w:t>
+              <w:t>0.329</w:t>
             </w:r>
           </w:p>
         </w:tc>
@@ -8653,7 +10168,7 @@
           </w:tcPr>
           <w:p>
             <w:r>
-              <w:t>0.566</w:t>
+              <w:t>0.740</w:t>
             </w:r>
           </w:p>
         </w:tc>
@@ -8694,9 +10209,11 @@
             <w:tcW w:w="1337" w:type="dxa"/>
           </w:tcPr>
           <w:p>
+            <w:proofErr w:type="spellStart"/>
             <w:r>
               <w:t>hard_erp</w:t>
             </w:r>
+            <w:proofErr w:type="spellEnd"/>
           </w:p>
         </w:tc>
         <w:tc>
@@ -8715,7 +10232,7 @@
           </w:tcPr>
           <w:p>
             <w:r>
-              <w:t>0.336</w:t>
+              <w:t>0.296</w:t>
             </w:r>
           </w:p>
         </w:tc>
@@ -8725,7 +10242,7 @@
           </w:tcPr>
           <w:p>
             <w:r>
-              <w:t>0.506</w:t>
+              <w:t>0.662</w:t>
             </w:r>
           </w:p>
         </w:tc>
@@ -8766,9 +10283,11 @@
             <w:tcW w:w="1337" w:type="dxa"/>
           </w:tcPr>
           <w:p>
+            <w:proofErr w:type="spellStart"/>
             <w:r>
               <w:t>hard_erp</w:t>
             </w:r>
+            <w:proofErr w:type="spellEnd"/>
           </w:p>
         </w:tc>
         <w:tc>
@@ -8787,7 +10306,7 @@
           </w:tcPr>
           <w:p>
             <w:r>
-              <w:t>0.618</w:t>
+              <w:t>0.763</w:t>
             </w:r>
           </w:p>
         </w:tc>
@@ -8797,7 +10316,7 @@
           </w:tcPr>
           <w:p>
             <w:r>
-              <w:t>0.584</w:t>
+              <w:t>0.609</w:t>
             </w:r>
           </w:p>
         </w:tc>
@@ -8838,9 +10357,11 @@
             <w:tcW w:w="1337" w:type="dxa"/>
           </w:tcPr>
           <w:p>
+            <w:proofErr w:type="spellStart"/>
             <w:r>
               <w:t>hard_erp</w:t>
             </w:r>
+            <w:proofErr w:type="spellEnd"/>
           </w:p>
         </w:tc>
         <w:tc>
@@ -8859,7 +10380,7 @@
           </w:tcPr>
           <w:p>
             <w:r>
-              <w:t>0.621</w:t>
+              <w:t>0.722</w:t>
             </w:r>
           </w:p>
         </w:tc>
@@ -8869,7 +10390,7 @@
           </w:tcPr>
           <w:p>
             <w:r>
-              <w:t>0.772</w:t>
+              <w:t>0.871</w:t>
             </w:r>
           </w:p>
         </w:tc>
@@ -8910,9 +10431,11 @@
             <w:tcW w:w="1337" w:type="dxa"/>
           </w:tcPr>
           <w:p>
+            <w:proofErr w:type="spellStart"/>
             <w:r>
               <w:t>hard_erp</w:t>
             </w:r>
+            <w:proofErr w:type="spellEnd"/>
           </w:p>
         </w:tc>
         <w:tc>
@@ -8931,7 +10454,7 @@
           </w:tcPr>
           <w:p>
             <w:r>
-              <w:t>0.564</w:t>
+              <w:t>0.641</w:t>
             </w:r>
           </w:p>
         </w:tc>
@@ -8941,7 +10464,7 @@
           </w:tcPr>
           <w:p>
             <w:r>
-              <w:t>0.726</w:t>
+              <w:t>0.860</w:t>
             </w:r>
           </w:p>
         </w:tc>
@@ -8982,9 +10505,11 @@
             <w:tcW w:w="1337" w:type="dxa"/>
           </w:tcPr>
           <w:p>
+            <w:proofErr w:type="spellStart"/>
             <w:r>
               <w:t>hard_erp</w:t>
             </w:r>
+            <w:proofErr w:type="spellEnd"/>
           </w:p>
         </w:tc>
         <w:tc>
@@ -9003,7 +10528,7 @@
           </w:tcPr>
           <w:p>
             <w:r>
-              <w:t>0.691</w:t>
+              <w:t>0.784</w:t>
             </w:r>
           </w:p>
         </w:tc>
@@ -9013,7 +10538,7 @@
           </w:tcPr>
           <w:p>
             <w:r>
-              <w:t>0.838</w:t>
+              <w:t>0.889</w:t>
             </w:r>
           </w:p>
         </w:tc>
@@ -9054,9 +10579,11 @@
             <w:tcW w:w="1337" w:type="dxa"/>
           </w:tcPr>
           <w:p>
+            <w:proofErr w:type="spellStart"/>
             <w:r>
               <w:t>hard_erp</w:t>
             </w:r>
+            <w:proofErr w:type="spellEnd"/>
           </w:p>
         </w:tc>
         <w:tc>
@@ -9075,7 +10602,7 @@
           </w:tcPr>
           <w:p>
             <w:r>
-              <w:t>0.252</w:t>
+              <w:t>0.288</w:t>
             </w:r>
           </w:p>
         </w:tc>
@@ -9085,7 +10612,7 @@
           </w:tcPr>
           <w:p>
             <w:r>
-              <w:t>0.491</w:t>
+              <w:t>0.452</w:t>
             </w:r>
           </w:p>
         </w:tc>
@@ -9126,9 +10653,11 @@
             <w:tcW w:w="1337" w:type="dxa"/>
           </w:tcPr>
           <w:p>
+            <w:proofErr w:type="spellStart"/>
             <w:r>
               <w:t>hard_erp</w:t>
             </w:r>
+            <w:proofErr w:type="spellEnd"/>
           </w:p>
         </w:tc>
         <w:tc>
@@ -9147,7 +10676,7 @@
           </w:tcPr>
           <w:p>
             <w:r>
-              <w:t>0.302</w:t>
+              <w:t>0.322</w:t>
             </w:r>
           </w:p>
         </w:tc>
@@ -9157,7 +10686,7 @@
           </w:tcPr>
           <w:p>
             <w:r>
-              <w:t>0.536</w:t>
+              <w:t>0.600</w:t>
             </w:r>
           </w:p>
         </w:tc>
@@ -9198,9 +10727,11 @@
             <w:tcW w:w="1337" w:type="dxa"/>
           </w:tcPr>
           <w:p>
+            <w:proofErr w:type="spellStart"/>
             <w:r>
               <w:t>hard_erp</w:t>
             </w:r>
+            <w:proofErr w:type="spellEnd"/>
           </w:p>
         </w:tc>
         <w:tc>
@@ -9219,7 +10750,7 @@
           </w:tcPr>
           <w:p>
             <w:r>
-              <w:t>0.521</w:t>
+              <w:t>0.722</w:t>
             </w:r>
           </w:p>
         </w:tc>
@@ -9229,7 +10760,7 @@
           </w:tcPr>
           <w:p>
             <w:r>
-              <w:t>0.528</w:t>
+              <w:t>0.545</w:t>
             </w:r>
           </w:p>
         </w:tc>
@@ -9270,9 +10801,11 @@
             <w:tcW w:w="1337" w:type="dxa"/>
           </w:tcPr>
           <w:p>
+            <w:proofErr w:type="spellStart"/>
             <w:r>
               <w:t>simple_portal</w:t>
             </w:r>
+            <w:proofErr w:type="spellEnd"/>
           </w:p>
         </w:tc>
         <w:tc>
@@ -9291,7 +10824,7 @@
           </w:tcPr>
           <w:p>
             <w:r>
-              <w:t>0.124</w:t>
+              <w:t>0.086</w:t>
             </w:r>
           </w:p>
         </w:tc>
@@ -9301,7 +10834,7 @@
           </w:tcPr>
           <w:p>
             <w:r>
-              <w:t>0.634</w:t>
+              <w:t>0.703</w:t>
             </w:r>
           </w:p>
         </w:tc>
@@ -9342,9 +10875,11 @@
             <w:tcW w:w="1337" w:type="dxa"/>
           </w:tcPr>
           <w:p>
+            <w:proofErr w:type="spellStart"/>
             <w:r>
               <w:t>simple_portal</w:t>
             </w:r>
+            <w:proofErr w:type="spellEnd"/>
           </w:p>
         </w:tc>
         <w:tc>
@@ -9363,7 +10898,7 @@
           </w:tcPr>
           <w:p>
             <w:r>
-              <w:t>0.512</w:t>
+              <w:t>0.714</w:t>
             </w:r>
           </w:p>
         </w:tc>
@@ -9373,7 +10908,7 @@
           </w:tcPr>
           <w:p>
             <w:r>
-              <w:t>0.975</w:t>
+              <w:t>0.897</w:t>
             </w:r>
           </w:p>
         </w:tc>
@@ -9414,9 +10949,11 @@
             <w:tcW w:w="1337" w:type="dxa"/>
           </w:tcPr>
           <w:p>
+            <w:proofErr w:type="spellStart"/>
             <w:r>
               <w:t>simple_portal</w:t>
             </w:r>
+            <w:proofErr w:type="spellEnd"/>
           </w:p>
         </w:tc>
         <w:tc>
@@ -9435,7 +10972,7 @@
           </w:tcPr>
           <w:p>
             <w:r>
-              <w:t>0.971</w:t>
+              <w:t>0.988</w:t>
             </w:r>
           </w:p>
         </w:tc>
@@ -9445,7 +10982,7 @@
           </w:tcPr>
           <w:p>
             <w:r>
-              <w:t>0.866</w:t>
+              <w:t>0.933</w:t>
             </w:r>
           </w:p>
         </w:tc>
@@ -9486,9 +11023,11 @@
             <w:tcW w:w="1337" w:type="dxa"/>
           </w:tcPr>
           <w:p>
+            <w:proofErr w:type="spellStart"/>
             <w:r>
               <w:t>simple_portal</w:t>
             </w:r>
+            <w:proofErr w:type="spellEnd"/>
           </w:p>
         </w:tc>
         <w:tc>
@@ -9507,7 +11046,7 @@
           </w:tcPr>
           <w:p>
             <w:r>
-              <w:t>0.330</w:t>
+              <w:t>0.362</w:t>
             </w:r>
           </w:p>
         </w:tc>
@@ -9517,7 +11056,7 @@
           </w:tcPr>
           <w:p>
             <w:r>
-              <w:t>0.894</w:t>
+              <w:t>0.931</w:t>
             </w:r>
           </w:p>
         </w:tc>
@@ -9558,9 +11097,11 @@
             <w:tcW w:w="1337" w:type="dxa"/>
           </w:tcPr>
           <w:p>
+            <w:proofErr w:type="spellStart"/>
             <w:r>
               <w:t>simple_portal</w:t>
             </w:r>
+            <w:proofErr w:type="spellEnd"/>
           </w:p>
         </w:tc>
         <w:tc>
@@ -9579,7 +11120,7 @@
           </w:tcPr>
           <w:p>
             <w:r>
-              <w:t>0.704</w:t>
+              <w:t>0.794</w:t>
             </w:r>
           </w:p>
         </w:tc>
@@ -9589,7 +11130,7 @@
           </w:tcPr>
           <w:p>
             <w:r>
-              <w:t>0.882</w:t>
+              <w:t>0.854</w:t>
             </w:r>
           </w:p>
         </w:tc>
@@ -9630,9 +11171,11 @@
             <w:tcW w:w="1337" w:type="dxa"/>
           </w:tcPr>
           <w:p>
+            <w:proofErr w:type="spellStart"/>
             <w:r>
               <w:t>simple_portal</w:t>
             </w:r>
+            <w:proofErr w:type="spellEnd"/>
           </w:p>
         </w:tc>
         <w:tc>
@@ -9651,7 +11194,7 @@
           </w:tcPr>
           <w:p>
             <w:r>
-              <w:t>0.673</w:t>
+              <w:t>0.732</w:t>
             </w:r>
           </w:p>
         </w:tc>
@@ -9661,7 +11204,7 @@
           </w:tcPr>
           <w:p>
             <w:r>
-              <w:t>0.869</w:t>
+              <w:t>0.868</w:t>
             </w:r>
           </w:p>
         </w:tc>
@@ -9702,9 +11245,11 @@
             <w:tcW w:w="1337" w:type="dxa"/>
           </w:tcPr>
           <w:p>
+            <w:proofErr w:type="spellStart"/>
             <w:r>
               <w:t>simple_portal</w:t>
             </w:r>
+            <w:proofErr w:type="spellEnd"/>
           </w:p>
         </w:tc>
         <w:tc>
@@ -9723,7 +11268,7 @@
           </w:tcPr>
           <w:p>
             <w:r>
-              <w:t>0.119</w:t>
+              <w:t>0.102</w:t>
             </w:r>
           </w:p>
         </w:tc>
@@ -9733,7 +11278,7 @@
           </w:tcPr>
           <w:p>
             <w:r>
-              <w:t>0.483</w:t>
+              <w:t>0.541</w:t>
             </w:r>
           </w:p>
         </w:tc>
@@ -9774,9 +11319,11 @@
             <w:tcW w:w="1337" w:type="dxa"/>
           </w:tcPr>
           <w:p>
+            <w:proofErr w:type="spellStart"/>
             <w:r>
               <w:t>simple_portal</w:t>
             </w:r>
+            <w:proofErr w:type="spellEnd"/>
           </w:p>
         </w:tc>
         <w:tc>
@@ -9795,7 +11342,7 @@
           </w:tcPr>
           <w:p>
             <w:r>
-              <w:t>0.571</w:t>
+              <w:t>0.652</w:t>
             </w:r>
           </w:p>
         </w:tc>
@@ -9805,7 +11352,7 @@
           </w:tcPr>
           <w:p>
             <w:r>
-              <w:t>0.927</w:t>
+              <w:t>0.977</w:t>
             </w:r>
           </w:p>
         </w:tc>
@@ -9846,9 +11393,11 @@
             <w:tcW w:w="1337" w:type="dxa"/>
           </w:tcPr>
           <w:p>
+            <w:proofErr w:type="spellStart"/>
             <w:r>
               <w:t>simple_portal</w:t>
             </w:r>
+            <w:proofErr w:type="spellEnd"/>
           </w:p>
         </w:tc>
         <w:tc>
@@ -9867,7 +11416,7 @@
           </w:tcPr>
           <w:p>
             <w:r>
-              <w:t>0.874</w:t>
+              <w:t>0.766</w:t>
             </w:r>
           </w:p>
         </w:tc>
@@ -9877,7 +11426,7 @@
           </w:tcPr>
           <w:p>
             <w:r>
-              <w:t>0.860</w:t>
+              <w:t>0.940</w:t>
             </w:r>
           </w:p>
         </w:tc>
@@ -9916,37 +11465,82 @@
     <w:p>
       <w:pPr>
         <w:pStyle w:val="Heading2"/>
-      </w:pPr>
-      <w:r>
-        <w:t>How to read the results</w:t>
-      </w:r>
-    </w:p>
-    <w:p>
-      <w:r>
-        <w:t>- Consolidation raises traceability (AlignScore precision) for every model: on simple_portal, Claude goes 0.12 -&gt; 0.97 and Gemini 0.12 -&gt; 0.87 from basic to strict.</w:t>
-      </w:r>
-    </w:p>
-    <w:p>
-      <w:r>
-        <w:t>- Precision/recall trade-off between loose and strict: strict compresses, so it gains precision and gives up a little recall (Claude simple_portal: loose 0.51/0.97 -&gt; strict 0.97/0.87).</w:t>
-      </w:r>
-    </w:p>
-    <w:p>
-      <w:r>
-        <w:t>- basic_prompt has low precision but decent recall: it covers the requirements yet bolts on non-traceable detail - the phenomenon the research question is about.</w:t>
-      </w:r>
-    </w:p>
-    <w:p>
-      <w:r>
-        <w:t>- Caveat: low AlignScore recall is not the same as a dropped requirement. It is graded entailment, so a requirement that is present but reworded or compressed scores below 1. For example Claude strict keeps all four navigation buttons, yet the 'must contain four buttons' sentence scores 0.18 because the candidate lists them without asserting 'four'. Read low recall as a flag to inspect, not proof of loss.</w:t>
-      </w:r>
-    </w:p>
-    <w:p>
-      <w:r>
-        <w:lastRenderedPageBreak/>
-        <w:t>- Caveat: the ground truths are still drafts, so these numbers are provisional; and both metrics currently split text by regex (sentence / bullet), which is not a reliable atomic requirement decomposition - the open item to be solved with an expert-verified gold list.</w:t>
-      </w:r>
-    </w:p>
+        <w:rPr>
+          <w:color w:val="auto"/>
+        </w:rPr>
+      </w:pPr>
+      <w:r>
+        <w:rPr>
+          <w:color w:val="auto"/>
+        </w:rPr>
+        <w:t xml:space="preserve">I just tried to run the table to </w:t>
+      </w:r>
+      <w:r>
+        <w:rPr>
+          <w:color w:val="auto"/>
+        </w:rPr>
+        <w:t>see if</w:t>
+      </w:r>
+      <w:r>
+        <w:rPr>
+          <w:color w:val="auto"/>
+        </w:rPr>
+        <w:t xml:space="preserve"> result </w:t>
+      </w:r>
+      <w:proofErr w:type="gramStart"/>
+      <w:r>
+        <w:rPr>
+          <w:color w:val="auto"/>
+        </w:rPr>
+        <w:t>are</w:t>
+      </w:r>
+      <w:proofErr w:type="gramEnd"/>
+      <w:r>
+        <w:rPr>
+          <w:color w:val="auto"/>
+        </w:rPr>
+        <w:t xml:space="preserve"> more reasonable and also </w:t>
+      </w:r>
+      <w:r>
+        <w:rPr>
+          <w:color w:val="auto"/>
+        </w:rPr>
+        <w:t xml:space="preserve">estimate the time it </w:t>
+      </w:r>
+      <w:proofErr w:type="gramStart"/>
+      <w:r>
+        <w:rPr>
+          <w:color w:val="auto"/>
+        </w:rPr>
+        <w:t>run</w:t>
+      </w:r>
+      <w:proofErr w:type="gramEnd"/>
+      <w:r>
+        <w:rPr>
+          <w:color w:val="auto"/>
+        </w:rPr>
+        <w:t xml:space="preserve"> </w:t>
+      </w:r>
+      <w:r>
+        <w:rPr>
+          <w:color w:val="auto"/>
+        </w:rPr>
+        <w:t>(</w:t>
+      </w:r>
+      <w:r>
+        <w:rPr>
+          <w:color w:val="auto"/>
+        </w:rPr>
+        <w:t>around ~ 1 hour 30 min</w:t>
+      </w:r>
+      <w:r>
+        <w:rPr>
+          <w:color w:val="auto"/>
+        </w:rPr>
+        <w:t>)</w:t>
+      </w:r>
+    </w:p>
+    <w:p/>
     <w:sectPr>
       <w:pgSz w:w="12240" w:h="15840"/>
       <w:pgMar w:top="1440" w:right="1440" w:bottom="1440" w:left="1440" w:header="708" w:footer="708" w:gutter="0"/>
@@ -10087,6 +11681,118 @@
     </w:lvl>
   </w:abstractNum>
   <w:abstractNum w:abstractNumId="1" w15:restartNumberingAfterBreak="0">
+    <w:nsid w:val="0D3A1337"/>
+    <w:multiLevelType w:val="hybridMultilevel"/>
+    <w:tmpl w:val="9E440346"/>
+    <w:lvl w:ilvl="0" w:tplc="16DC3CB0">
+      <w:numFmt w:val="bullet"/>
+      <w:lvlText w:val="-"/>
+      <w:lvlJc w:val="left"/>
+      <w:pPr>
+        <w:ind w:left="420" w:hanging="360"/>
+      </w:pPr>
+      <w:rPr>
+        <w:rFonts w:ascii="Arial" w:eastAsia="Arial" w:hAnsi="Arial" w:cs="Arial" w:hint="default"/>
+      </w:rPr>
+    </w:lvl>
+    <w:lvl w:ilvl="1" w:tplc="04090003" w:tentative="1">
+      <w:start w:val="1"/>
+      <w:numFmt w:val="bullet"/>
+      <w:lvlText w:val="o"/>
+      <w:lvlJc w:val="left"/>
+      <w:pPr>
+        <w:ind w:left="1140" w:hanging="360"/>
+      </w:pPr>
+      <w:rPr>
+        <w:rFonts w:ascii="Courier New" w:hAnsi="Courier New" w:cs="Courier New" w:hint="default"/>
+      </w:rPr>
+    </w:lvl>
+    <w:lvl w:ilvl="2" w:tplc="04090005" w:tentative="1">
+      <w:start w:val="1"/>
+      <w:numFmt w:val="bullet"/>
+      <w:lvlText w:val=""/>
+      <w:lvlJc w:val="left"/>
+      <w:pPr>
+        <w:ind w:left="1860" w:hanging="360"/>
+      </w:pPr>
+      <w:rPr>
+        <w:rFonts w:ascii="Wingdings" w:hAnsi="Wingdings" w:hint="default"/>
+      </w:rPr>
+    </w:lvl>
+    <w:lvl w:ilvl="3" w:tplc="04090001" w:tentative="1">
+      <w:start w:val="1"/>
+      <w:numFmt w:val="bullet"/>
+      <w:lvlText w:val=""/>
+      <w:lvlJc w:val="left"/>
+      <w:pPr>
+        <w:ind w:left="2580" w:hanging="360"/>
+      </w:pPr>
+      <w:rPr>
+        <w:rFonts w:ascii="Symbol" w:hAnsi="Symbol" w:hint="default"/>
+      </w:rPr>
+    </w:lvl>
+    <w:lvl w:ilvl="4" w:tplc="04090003" w:tentative="1">
+      <w:start w:val="1"/>
+      <w:numFmt w:val="bullet"/>
+      <w:lvlText w:val="o"/>
+      <w:lvlJc w:val="left"/>
+      <w:pPr>
+        <w:ind w:left="3300" w:hanging="360"/>
+      </w:pPr>
+      <w:rPr>
+        <w:rFonts w:ascii="Courier New" w:hAnsi="Courier New" w:cs="Courier New" w:hint="default"/>
+      </w:rPr>
+    </w:lvl>
+    <w:lvl w:ilvl="5" w:tplc="04090005" w:tentative="1">
+      <w:start w:val="1"/>
+      <w:numFmt w:val="bullet"/>
+      <w:lvlText w:val=""/>
+      <w:lvlJc w:val="left"/>
+      <w:pPr>
+        <w:ind w:left="4020" w:hanging="360"/>
+      </w:pPr>
+      <w:rPr>
+        <w:rFonts w:ascii="Wingdings" w:hAnsi="Wingdings" w:hint="default"/>
+      </w:rPr>
+    </w:lvl>
+    <w:lvl w:ilvl="6" w:tplc="04090001" w:tentative="1">
+      <w:start w:val="1"/>
+      <w:numFmt w:val="bullet"/>
+      <w:lvlText w:val=""/>
+      <w:lvlJc w:val="left"/>
+      <w:pPr>
+        <w:ind w:left="4740" w:hanging="360"/>
+      </w:pPr>
+      <w:rPr>
+        <w:rFonts w:ascii="Symbol" w:hAnsi="Symbol" w:hint="default"/>
+      </w:rPr>
+    </w:lvl>
+    <w:lvl w:ilvl="7" w:tplc="04090003" w:tentative="1">
+      <w:start w:val="1"/>
+      <w:numFmt w:val="bullet"/>
+      <w:lvlText w:val="o"/>
+      <w:lvlJc w:val="left"/>
+      <w:pPr>
+        <w:ind w:left="5460" w:hanging="360"/>
+      </w:pPr>
+      <w:rPr>
+        <w:rFonts w:ascii="Courier New" w:hAnsi="Courier New" w:cs="Courier New" w:hint="default"/>
+      </w:rPr>
+    </w:lvl>
+    <w:lvl w:ilvl="8" w:tplc="04090005" w:tentative="1">
+      <w:start w:val="1"/>
+      <w:numFmt w:val="bullet"/>
+      <w:lvlText w:val=""/>
+      <w:lvlJc w:val="left"/>
+      <w:pPr>
+        <w:ind w:left="6180" w:hanging="360"/>
+      </w:pPr>
+      <w:rPr>
+        <w:rFonts w:ascii="Wingdings" w:hAnsi="Wingdings" w:hint="default"/>
+      </w:rPr>
+    </w:lvl>
+  </w:abstractNum>
+  <w:abstractNum w:abstractNumId="2" w15:restartNumberingAfterBreak="0">
     <w:nsid w:val="1EE26FBB"/>
     <w:multiLevelType w:val="hybridMultilevel"/>
     <w:tmpl w:val="B5A2921C"/>
@@ -10199,7 +11905,380 @@
       </w:rPr>
     </w:lvl>
   </w:abstractNum>
-  <w:abstractNum w:abstractNumId="2" w15:restartNumberingAfterBreak="0">
+  <w:abstractNum w:abstractNumId="3" w15:restartNumberingAfterBreak="0">
+    <w:nsid w:val="209C2F69"/>
+    <w:multiLevelType w:val="hybridMultilevel"/>
+    <w:tmpl w:val="FAEA6470"/>
+    <w:lvl w:ilvl="0" w:tplc="4EC42B28">
+      <w:numFmt w:val="bullet"/>
+      <w:lvlText w:val="-"/>
+      <w:lvlJc w:val="left"/>
+      <w:pPr>
+        <w:ind w:left="720" w:hanging="360"/>
+      </w:pPr>
+      <w:rPr>
+        <w:rFonts w:ascii="Arial" w:eastAsia="Arial" w:hAnsi="Arial" w:cs="Arial" w:hint="default"/>
+      </w:rPr>
+    </w:lvl>
+    <w:lvl w:ilvl="1" w:tplc="04090003" w:tentative="1">
+      <w:start w:val="1"/>
+      <w:numFmt w:val="bullet"/>
+      <w:lvlText w:val="o"/>
+      <w:lvlJc w:val="left"/>
+      <w:pPr>
+        <w:ind w:left="1440" w:hanging="360"/>
+      </w:pPr>
+      <w:rPr>
+        <w:rFonts w:ascii="Courier New" w:hAnsi="Courier New" w:cs="Courier New" w:hint="default"/>
+      </w:rPr>
+    </w:lvl>
+    <w:lvl w:ilvl="2" w:tplc="04090005" w:tentative="1">
+      <w:start w:val="1"/>
+      <w:numFmt w:val="bullet"/>
+      <w:lvlText w:val=""/>
+      <w:lvlJc w:val="left"/>
+      <w:pPr>
+        <w:ind w:left="2160" w:hanging="360"/>
+      </w:pPr>
+      <w:rPr>
+        <w:rFonts w:ascii="Wingdings" w:hAnsi="Wingdings" w:hint="default"/>
+      </w:rPr>
+    </w:lvl>
+    <w:lvl w:ilvl="3" w:tplc="04090001" w:tentative="1">
+      <w:start w:val="1"/>
+      <w:numFmt w:val="bullet"/>
+      <w:lvlText w:val=""/>
+      <w:lvlJc w:val="left"/>
+      <w:pPr>
+        <w:ind w:left="2880" w:hanging="360"/>
+      </w:pPr>
+      <w:rPr>
+        <w:rFonts w:ascii="Symbol" w:hAnsi="Symbol" w:hint="default"/>
+      </w:rPr>
+    </w:lvl>
+    <w:lvl w:ilvl="4" w:tplc="04090003" w:tentative="1">
+      <w:start w:val="1"/>
+      <w:numFmt w:val="bullet"/>
+      <w:lvlText w:val="o"/>
+      <w:lvlJc w:val="left"/>
+      <w:pPr>
+        <w:ind w:left="3600" w:hanging="360"/>
+      </w:pPr>
+      <w:rPr>
+        <w:rFonts w:ascii="Courier New" w:hAnsi="Courier New" w:cs="Courier New" w:hint="default"/>
+      </w:rPr>
+    </w:lvl>
+    <w:lvl w:ilvl="5" w:tplc="04090005" w:tentative="1">
+      <w:start w:val="1"/>
+      <w:numFmt w:val="bullet"/>
+      <w:lvlText w:val=""/>
+      <w:lvlJc w:val="left"/>
+      <w:pPr>
+        <w:ind w:left="4320" w:hanging="360"/>
+      </w:pPr>
+      <w:rPr>
+        <w:rFonts w:ascii="Wingdings" w:hAnsi="Wingdings" w:hint="default"/>
+      </w:rPr>
+    </w:lvl>
+    <w:lvl w:ilvl="6" w:tplc="04090001" w:tentative="1">
+      <w:start w:val="1"/>
+      <w:numFmt w:val="bullet"/>
+      <w:lvlText w:val=""/>
+      <w:lvlJc w:val="left"/>
+      <w:pPr>
+        <w:ind w:left="5040" w:hanging="360"/>
+      </w:pPr>
+      <w:rPr>
+        <w:rFonts w:ascii="Symbol" w:hAnsi="Symbol" w:hint="default"/>
+      </w:rPr>
+    </w:lvl>
+    <w:lvl w:ilvl="7" w:tplc="04090003" w:tentative="1">
+      <w:start w:val="1"/>
+      <w:numFmt w:val="bullet"/>
+      <w:lvlText w:val="o"/>
+      <w:lvlJc w:val="left"/>
+      <w:pPr>
+        <w:ind w:left="5760" w:hanging="360"/>
+      </w:pPr>
+      <w:rPr>
+        <w:rFonts w:ascii="Courier New" w:hAnsi="Courier New" w:cs="Courier New" w:hint="default"/>
+      </w:rPr>
+    </w:lvl>
+    <w:lvl w:ilvl="8" w:tplc="04090005" w:tentative="1">
+      <w:start w:val="1"/>
+      <w:numFmt w:val="bullet"/>
+      <w:lvlText w:val=""/>
+      <w:lvlJc w:val="left"/>
+      <w:pPr>
+        <w:ind w:left="6480" w:hanging="360"/>
+      </w:pPr>
+      <w:rPr>
+        <w:rFonts w:ascii="Wingdings" w:hAnsi="Wingdings" w:hint="default"/>
+      </w:rPr>
+    </w:lvl>
+  </w:abstractNum>
+  <w:abstractNum w:abstractNumId="4" w15:restartNumberingAfterBreak="0">
+    <w:nsid w:val="2C503FC7"/>
+    <w:multiLevelType w:val="multilevel"/>
+    <w:tmpl w:val="E15AE186"/>
+    <w:lvl w:ilvl="0">
+      <w:start w:val="1"/>
+      <w:numFmt w:val="bullet"/>
+      <w:lvlText w:val=""/>
+      <w:lvlJc w:val="left"/>
+      <w:pPr>
+        <w:tabs>
+          <w:tab w:val="num" w:pos="720"/>
+        </w:tabs>
+        <w:ind w:left="720" w:hanging="360"/>
+      </w:pPr>
+      <w:rPr>
+        <w:rFonts w:ascii="Symbol" w:hAnsi="Symbol" w:hint="default"/>
+        <w:sz w:val="20"/>
+      </w:rPr>
+    </w:lvl>
+    <w:lvl w:ilvl="1" w:tentative="1">
+      <w:start w:val="1"/>
+      <w:numFmt w:val="bullet"/>
+      <w:lvlText w:val="o"/>
+      <w:lvlJc w:val="left"/>
+      <w:pPr>
+        <w:tabs>
+          <w:tab w:val="num" w:pos="1440"/>
+        </w:tabs>
+        <w:ind w:left="1440" w:hanging="360"/>
+      </w:pPr>
+      <w:rPr>
+        <w:rFonts w:ascii="Courier New" w:hAnsi="Courier New" w:hint="default"/>
+        <w:sz w:val="20"/>
+      </w:rPr>
+    </w:lvl>
+    <w:lvl w:ilvl="2" w:tentative="1">
+      <w:start w:val="1"/>
+      <w:numFmt w:val="bullet"/>
+      <w:lvlText w:val=""/>
+      <w:lvlJc w:val="left"/>
+      <w:pPr>
+        <w:tabs>
+          <w:tab w:val="num" w:pos="2160"/>
+        </w:tabs>
+        <w:ind w:left="2160" w:hanging="360"/>
+      </w:pPr>
+      <w:rPr>
+        <w:rFonts w:ascii="Wingdings" w:hAnsi="Wingdings" w:hint="default"/>
+        <w:sz w:val="20"/>
+      </w:rPr>
+    </w:lvl>
+    <w:lvl w:ilvl="3" w:tentative="1">
+      <w:start w:val="1"/>
+      <w:numFmt w:val="bullet"/>
+      <w:lvlText w:val=""/>
+      <w:lvlJc w:val="left"/>
+      <w:pPr>
+        <w:tabs>
+          <w:tab w:val="num" w:pos="2880"/>
+        </w:tabs>
+        <w:ind w:left="2880" w:hanging="360"/>
+      </w:pPr>
+      <w:rPr>
+        <w:rFonts w:ascii="Wingdings" w:hAnsi="Wingdings" w:hint="default"/>
+        <w:sz w:val="20"/>
+      </w:rPr>
+    </w:lvl>
+    <w:lvl w:ilvl="4" w:tentative="1">
+      <w:start w:val="1"/>
+      <w:numFmt w:val="bullet"/>
+      <w:lvlText w:val=""/>
+      <w:lvlJc w:val="left"/>
+      <w:pPr>
+        <w:tabs>
+          <w:tab w:val="num" w:pos="3600"/>
+        </w:tabs>
+        <w:ind w:left="3600" w:hanging="360"/>
+      </w:pPr>
+      <w:rPr>
+        <w:rFonts w:ascii="Wingdings" w:hAnsi="Wingdings" w:hint="default"/>
+        <w:sz w:val="20"/>
+      </w:rPr>
+    </w:lvl>
+    <w:lvl w:ilvl="5" w:tentative="1">
+      <w:start w:val="1"/>
+      <w:numFmt w:val="bullet"/>
+      <w:lvlText w:val=""/>
+      <w:lvlJc w:val="left"/>
+      <w:pPr>
+        <w:tabs>
+          <w:tab w:val="num" w:pos="4320"/>
+        </w:tabs>
+        <w:ind w:left="4320" w:hanging="360"/>
+      </w:pPr>
+      <w:rPr>
+        <w:rFonts w:ascii="Wingdings" w:hAnsi="Wingdings" w:hint="default"/>
+        <w:sz w:val="20"/>
+      </w:rPr>
+    </w:lvl>
+    <w:lvl w:ilvl="6" w:tentative="1">
+      <w:start w:val="1"/>
+      <w:numFmt w:val="bullet"/>
+      <w:lvlText w:val=""/>
+      <w:lvlJc w:val="left"/>
+      <w:pPr>
+        <w:tabs>
+          <w:tab w:val="num" w:pos="5040"/>
+        </w:tabs>
+        <w:ind w:left="5040" w:hanging="360"/>
+      </w:pPr>
+      <w:rPr>
+        <w:rFonts w:ascii="Wingdings" w:hAnsi="Wingdings" w:hint="default"/>
+        <w:sz w:val="20"/>
+      </w:rPr>
+    </w:lvl>
+    <w:lvl w:ilvl="7" w:tentative="1">
+      <w:start w:val="1"/>
+      <w:numFmt w:val="bullet"/>
+      <w:lvlText w:val=""/>
+      <w:lvlJc w:val="left"/>
+      <w:pPr>
+        <w:tabs>
+          <w:tab w:val="num" w:pos="5760"/>
+        </w:tabs>
+        <w:ind w:left="5760" w:hanging="360"/>
+      </w:pPr>
+      <w:rPr>
+        <w:rFonts w:ascii="Wingdings" w:hAnsi="Wingdings" w:hint="default"/>
+        <w:sz w:val="20"/>
+      </w:rPr>
+    </w:lvl>
+    <w:lvl w:ilvl="8" w:tentative="1">
+      <w:start w:val="1"/>
+      <w:numFmt w:val="bullet"/>
+      <w:lvlText w:val=""/>
+      <w:lvlJc w:val="left"/>
+      <w:pPr>
+        <w:tabs>
+          <w:tab w:val="num" w:pos="6480"/>
+        </w:tabs>
+        <w:ind w:left="6480" w:hanging="360"/>
+      </w:pPr>
+      <w:rPr>
+        <w:rFonts w:ascii="Wingdings" w:hAnsi="Wingdings" w:hint="default"/>
+        <w:sz w:val="20"/>
+      </w:rPr>
+    </w:lvl>
+  </w:abstractNum>
+  <w:abstractNum w:abstractNumId="5" w15:restartNumberingAfterBreak="0">
+    <w:nsid w:val="2FE94034"/>
+    <w:multiLevelType w:val="hybridMultilevel"/>
+    <w:tmpl w:val="A33E0EEE"/>
+    <w:lvl w:ilvl="0" w:tplc="40382624">
+      <w:numFmt w:val="bullet"/>
+      <w:lvlText w:val="-"/>
+      <w:lvlJc w:val="left"/>
+      <w:pPr>
+        <w:ind w:left="720" w:hanging="360"/>
+      </w:pPr>
+      <w:rPr>
+        <w:rFonts w:ascii="Arial" w:eastAsia="Arial" w:hAnsi="Arial" w:cs="Arial" w:hint="default"/>
+      </w:rPr>
+    </w:lvl>
+    <w:lvl w:ilvl="1" w:tplc="04090003" w:tentative="1">
+      <w:start w:val="1"/>
+      <w:numFmt w:val="bullet"/>
+      <w:lvlText w:val="o"/>
+      <w:lvlJc w:val="left"/>
+      <w:pPr>
+        <w:ind w:left="1440" w:hanging="360"/>
+      </w:pPr>
+      <w:rPr>
+        <w:rFonts w:ascii="Courier New" w:hAnsi="Courier New" w:cs="Courier New" w:hint="default"/>
+      </w:rPr>
+    </w:lvl>
+    <w:lvl w:ilvl="2" w:tplc="04090005" w:tentative="1">
+      <w:start w:val="1"/>
+      <w:numFmt w:val="bullet"/>
+      <w:lvlText w:val=""/>
+      <w:lvlJc w:val="left"/>
+      <w:pPr>
+        <w:ind w:left="2160" w:hanging="360"/>
+      </w:pPr>
+      <w:rPr>
+        <w:rFonts w:ascii="Wingdings" w:hAnsi="Wingdings" w:hint="default"/>
+      </w:rPr>
+    </w:lvl>
+    <w:lvl w:ilvl="3" w:tplc="04090001" w:tentative="1">
+      <w:start w:val="1"/>
+      <w:numFmt w:val="bullet"/>
+      <w:lvlText w:val=""/>
+      <w:lvlJc w:val="left"/>
+      <w:pPr>
+        <w:ind w:left="2880" w:hanging="360"/>
+      </w:pPr>
+      <w:rPr>
+        <w:rFonts w:ascii="Symbol" w:hAnsi="Symbol" w:hint="default"/>
+      </w:rPr>
+    </w:lvl>
+    <w:lvl w:ilvl="4" w:tplc="04090003" w:tentative="1">
+      <w:start w:val="1"/>
+      <w:numFmt w:val="bullet"/>
+      <w:lvlText w:val="o"/>
+      <w:lvlJc w:val="left"/>
+      <w:pPr>
+        <w:ind w:left="3600" w:hanging="360"/>
+      </w:pPr>
+      <w:rPr>
+        <w:rFonts w:ascii="Courier New" w:hAnsi="Courier New" w:cs="Courier New" w:hint="default"/>
+      </w:rPr>
+    </w:lvl>
+    <w:lvl w:ilvl="5" w:tplc="04090005" w:tentative="1">
+      <w:start w:val="1"/>
+      <w:numFmt w:val="bullet"/>
+      <w:lvlText w:val=""/>
+      <w:lvlJc w:val="left"/>
+      <w:pPr>
+        <w:ind w:left="4320" w:hanging="360"/>
+      </w:pPr>
+      <w:rPr>
+        <w:rFonts w:ascii="Wingdings" w:hAnsi="Wingdings" w:hint="default"/>
+      </w:rPr>
+    </w:lvl>
+    <w:lvl w:ilvl="6" w:tplc="04090001" w:tentative="1">
+      <w:start w:val="1"/>
+      <w:numFmt w:val="bullet"/>
+      <w:lvlText w:val=""/>
+      <w:lvlJc w:val="left"/>
+      <w:pPr>
+        <w:ind w:left="5040" w:hanging="360"/>
+      </w:pPr>
+      <w:rPr>
+        <w:rFonts w:ascii="Symbol" w:hAnsi="Symbol" w:hint="default"/>
+      </w:rPr>
+    </w:lvl>
+    <w:lvl w:ilvl="7" w:tplc="04090003" w:tentative="1">
+      <w:start w:val="1"/>
+      <w:numFmt w:val="bullet"/>
+      <w:lvlText w:val="o"/>
+      <w:lvlJc w:val="left"/>
+      <w:pPr>
+        <w:ind w:left="5760" w:hanging="360"/>
+      </w:pPr>
+      <w:rPr>
+        <w:rFonts w:ascii="Courier New" w:hAnsi="Courier New" w:cs="Courier New" w:hint="default"/>
+      </w:rPr>
+    </w:lvl>
+    <w:lvl w:ilvl="8" w:tplc="04090005" w:tentative="1">
+      <w:start w:val="1"/>
+      <w:numFmt w:val="bullet"/>
+      <w:lvlText w:val=""/>
+      <w:lvlJc w:val="left"/>
+      <w:pPr>
+        <w:ind w:left="6480" w:hanging="360"/>
+      </w:pPr>
+      <w:rPr>
+        <w:rFonts w:ascii="Wingdings" w:hAnsi="Wingdings" w:hint="default"/>
+      </w:rPr>
+    </w:lvl>
+  </w:abstractNum>
+  <w:abstractNum w:abstractNumId="6" w15:restartNumberingAfterBreak="0">
     <w:nsid w:val="315431FE"/>
     <w:multiLevelType w:val="hybridMultilevel"/>
     <w:tmpl w:val="575CF67E"/>
@@ -10312,7 +12391,7 @@
       </w:rPr>
     </w:lvl>
   </w:abstractNum>
-  <w:abstractNum w:abstractNumId="3" w15:restartNumberingAfterBreak="0">
+  <w:abstractNum w:abstractNumId="7" w15:restartNumberingAfterBreak="0">
     <w:nsid w:val="351D578B"/>
     <w:multiLevelType w:val="hybridMultilevel"/>
     <w:tmpl w:val="7FECF036"/>
@@ -10425,7 +12504,7 @@
       </w:rPr>
     </w:lvl>
   </w:abstractNum>
-  <w:abstractNum w:abstractNumId="4" w15:restartNumberingAfterBreak="0">
+  <w:abstractNum w:abstractNumId="8" w15:restartNumberingAfterBreak="0">
     <w:nsid w:val="355F4642"/>
     <w:multiLevelType w:val="hybridMultilevel"/>
     <w:tmpl w:val="30E4E3D4"/>
@@ -10511,7 +12590,7 @@
       </w:pPr>
     </w:lvl>
   </w:abstractNum>
-  <w:abstractNum w:abstractNumId="5" w15:restartNumberingAfterBreak="0">
+  <w:abstractNum w:abstractNumId="9" w15:restartNumberingAfterBreak="0">
     <w:nsid w:val="36F91FDF"/>
     <w:multiLevelType w:val="hybridMultilevel"/>
     <w:tmpl w:val="CCA8C02E"/>
@@ -10565,7 +12644,119 @@
       <w:lvlJc w:val="left"/>
     </w:lvl>
   </w:abstractNum>
-  <w:abstractNum w:abstractNumId="6" w15:restartNumberingAfterBreak="0">
+  <w:abstractNum w:abstractNumId="10" w15:restartNumberingAfterBreak="0">
+    <w:nsid w:val="3B08726F"/>
+    <w:multiLevelType w:val="hybridMultilevel"/>
+    <w:tmpl w:val="11E855BC"/>
+    <w:lvl w:ilvl="0" w:tplc="A6CA1DC2">
+      <w:numFmt w:val="bullet"/>
+      <w:lvlText w:val="-"/>
+      <w:lvlJc w:val="left"/>
+      <w:pPr>
+        <w:ind w:left="720" w:hanging="360"/>
+      </w:pPr>
+      <w:rPr>
+        <w:rFonts w:ascii="Arial" w:eastAsia="Arial" w:hAnsi="Arial" w:cs="Arial" w:hint="default"/>
+      </w:rPr>
+    </w:lvl>
+    <w:lvl w:ilvl="1" w:tplc="04090003" w:tentative="1">
+      <w:start w:val="1"/>
+      <w:numFmt w:val="bullet"/>
+      <w:lvlText w:val="o"/>
+      <w:lvlJc w:val="left"/>
+      <w:pPr>
+        <w:ind w:left="1440" w:hanging="360"/>
+      </w:pPr>
+      <w:rPr>
+        <w:rFonts w:ascii="Courier New" w:hAnsi="Courier New" w:cs="Courier New" w:hint="default"/>
+      </w:rPr>
+    </w:lvl>
+    <w:lvl w:ilvl="2" w:tplc="04090005" w:tentative="1">
+      <w:start w:val="1"/>
+      <w:numFmt w:val="bullet"/>
+      <w:lvlText w:val=""/>
+      <w:lvlJc w:val="left"/>
+      <w:pPr>
+        <w:ind w:left="2160" w:hanging="360"/>
+      </w:pPr>
+      <w:rPr>
+        <w:rFonts w:ascii="Wingdings" w:hAnsi="Wingdings" w:hint="default"/>
+      </w:rPr>
+    </w:lvl>
+    <w:lvl w:ilvl="3" w:tplc="04090001" w:tentative="1">
+      <w:start w:val="1"/>
+      <w:numFmt w:val="bullet"/>
+      <w:lvlText w:val=""/>
+      <w:lvlJc w:val="left"/>
+      <w:pPr>
+        <w:ind w:left="2880" w:hanging="360"/>
+      </w:pPr>
+      <w:rPr>
+        <w:rFonts w:ascii="Symbol" w:hAnsi="Symbol" w:hint="default"/>
+      </w:rPr>
+    </w:lvl>
+    <w:lvl w:ilvl="4" w:tplc="04090003" w:tentative="1">
+      <w:start w:val="1"/>
+      <w:numFmt w:val="bullet"/>
+      <w:lvlText w:val="o"/>
+      <w:lvlJc w:val="left"/>
+      <w:pPr>
+        <w:ind w:left="3600" w:hanging="360"/>
+      </w:pPr>
+      <w:rPr>
+        <w:rFonts w:ascii="Courier New" w:hAnsi="Courier New" w:cs="Courier New" w:hint="default"/>
+      </w:rPr>
+    </w:lvl>
+    <w:lvl w:ilvl="5" w:tplc="04090005" w:tentative="1">
+      <w:start w:val="1"/>
+      <w:numFmt w:val="bullet"/>
+      <w:lvlText w:val=""/>
+      <w:lvlJc w:val="left"/>
+      <w:pPr>
+        <w:ind w:left="4320" w:hanging="360"/>
+      </w:pPr>
+      <w:rPr>
+        <w:rFonts w:ascii="Wingdings" w:hAnsi="Wingdings" w:hint="default"/>
+      </w:rPr>
+    </w:lvl>
+    <w:lvl w:ilvl="6" w:tplc="04090001" w:tentative="1">
+      <w:start w:val="1"/>
+      <w:numFmt w:val="bullet"/>
+      <w:lvlText w:val=""/>
+      <w:lvlJc w:val="left"/>
+      <w:pPr>
+        <w:ind w:left="5040" w:hanging="360"/>
+      </w:pPr>
+      <w:rPr>
+        <w:rFonts w:ascii="Symbol" w:hAnsi="Symbol" w:hint="default"/>
+      </w:rPr>
+    </w:lvl>
+    <w:lvl w:ilvl="7" w:tplc="04090003" w:tentative="1">
+      <w:start w:val="1"/>
+      <w:numFmt w:val="bullet"/>
+      <w:lvlText w:val="o"/>
+      <w:lvlJc w:val="left"/>
+      <w:pPr>
+        <w:ind w:left="5760" w:hanging="360"/>
+      </w:pPr>
+      <w:rPr>
+        <w:rFonts w:ascii="Courier New" w:hAnsi="Courier New" w:cs="Courier New" w:hint="default"/>
+      </w:rPr>
+    </w:lvl>
+    <w:lvl w:ilvl="8" w:tplc="04090005" w:tentative="1">
+      <w:start w:val="1"/>
+      <w:numFmt w:val="bullet"/>
+      <w:lvlText w:val=""/>
+      <w:lvlJc w:val="left"/>
+      <w:pPr>
+        <w:ind w:left="6480" w:hanging="360"/>
+      </w:pPr>
+      <w:rPr>
+        <w:rFonts w:ascii="Wingdings" w:hAnsi="Wingdings" w:hint="default"/>
+      </w:rPr>
+    </w:lvl>
+  </w:abstractNum>
+  <w:abstractNum w:abstractNumId="11" w15:restartNumberingAfterBreak="0">
     <w:nsid w:val="3E004BDB"/>
     <w:multiLevelType w:val="hybridMultilevel"/>
     <w:tmpl w:val="A4F83AB6"/>
@@ -10678,7 +12869,119 @@
       </w:rPr>
     </w:lvl>
   </w:abstractNum>
-  <w:abstractNum w:abstractNumId="7" w15:restartNumberingAfterBreak="0">
+  <w:abstractNum w:abstractNumId="12" w15:restartNumberingAfterBreak="0">
+    <w:nsid w:val="53790CEA"/>
+    <w:multiLevelType w:val="hybridMultilevel"/>
+    <w:tmpl w:val="61543B32"/>
+    <w:lvl w:ilvl="0" w:tplc="6F9ABEC0">
+      <w:numFmt w:val="bullet"/>
+      <w:lvlText w:val="-"/>
+      <w:lvlJc w:val="left"/>
+      <w:pPr>
+        <w:ind w:left="720" w:hanging="360"/>
+      </w:pPr>
+      <w:rPr>
+        <w:rFonts w:ascii="Arial" w:eastAsia="Arial" w:hAnsi="Arial" w:cs="Arial" w:hint="default"/>
+      </w:rPr>
+    </w:lvl>
+    <w:lvl w:ilvl="1" w:tplc="04090003" w:tentative="1">
+      <w:start w:val="1"/>
+      <w:numFmt w:val="bullet"/>
+      <w:lvlText w:val="o"/>
+      <w:lvlJc w:val="left"/>
+      <w:pPr>
+        <w:ind w:left="1440" w:hanging="360"/>
+      </w:pPr>
+      <w:rPr>
+        <w:rFonts w:ascii="Courier New" w:hAnsi="Courier New" w:cs="Courier New" w:hint="default"/>
+      </w:rPr>
+    </w:lvl>
+    <w:lvl w:ilvl="2" w:tplc="04090005" w:tentative="1">
+      <w:start w:val="1"/>
+      <w:numFmt w:val="bullet"/>
+      <w:lvlText w:val=""/>
+      <w:lvlJc w:val="left"/>
+      <w:pPr>
+        <w:ind w:left="2160" w:hanging="360"/>
+      </w:pPr>
+      <w:rPr>
+        <w:rFonts w:ascii="Wingdings" w:hAnsi="Wingdings" w:hint="default"/>
+      </w:rPr>
+    </w:lvl>
+    <w:lvl w:ilvl="3" w:tplc="04090001" w:tentative="1">
+      <w:start w:val="1"/>
+      <w:numFmt w:val="bullet"/>
+      <w:lvlText w:val=""/>
+      <w:lvlJc w:val="left"/>
+      <w:pPr>
+        <w:ind w:left="2880" w:hanging="360"/>
+      </w:pPr>
+      <w:rPr>
+        <w:rFonts w:ascii="Symbol" w:hAnsi="Symbol" w:hint="default"/>
+      </w:rPr>
+    </w:lvl>
+    <w:lvl w:ilvl="4" w:tplc="04090003" w:tentative="1">
+      <w:start w:val="1"/>
+      <w:numFmt w:val="bullet"/>
+      <w:lvlText w:val="o"/>
+      <w:lvlJc w:val="left"/>
+      <w:pPr>
+        <w:ind w:left="3600" w:hanging="360"/>
+      </w:pPr>
+      <w:rPr>
+        <w:rFonts w:ascii="Courier New" w:hAnsi="Courier New" w:cs="Courier New" w:hint="default"/>
+      </w:rPr>
+    </w:lvl>
+    <w:lvl w:ilvl="5" w:tplc="04090005" w:tentative="1">
+      <w:start w:val="1"/>
+      <w:numFmt w:val="bullet"/>
+      <w:lvlText w:val=""/>
+      <w:lvlJc w:val="left"/>
+      <w:pPr>
+        <w:ind w:left="4320" w:hanging="360"/>
+      </w:pPr>
+      <w:rPr>
+        <w:rFonts w:ascii="Wingdings" w:hAnsi="Wingdings" w:hint="default"/>
+      </w:rPr>
+    </w:lvl>
+    <w:lvl w:ilvl="6" w:tplc="04090001" w:tentative="1">
+      <w:start w:val="1"/>
+      <w:numFmt w:val="bullet"/>
+      <w:lvlText w:val=""/>
+      <w:lvlJc w:val="left"/>
+      <w:pPr>
+        <w:ind w:left="5040" w:hanging="360"/>
+      </w:pPr>
+      <w:rPr>
+        <w:rFonts w:ascii="Symbol" w:hAnsi="Symbol" w:hint="default"/>
+      </w:rPr>
+    </w:lvl>
+    <w:lvl w:ilvl="7" w:tplc="04090003" w:tentative="1">
+      <w:start w:val="1"/>
+      <w:numFmt w:val="bullet"/>
+      <w:lvlText w:val="o"/>
+      <w:lvlJc w:val="left"/>
+      <w:pPr>
+        <w:ind w:left="5760" w:hanging="360"/>
+      </w:pPr>
+      <w:rPr>
+        <w:rFonts w:ascii="Courier New" w:hAnsi="Courier New" w:cs="Courier New" w:hint="default"/>
+      </w:rPr>
+    </w:lvl>
+    <w:lvl w:ilvl="8" w:tplc="04090005" w:tentative="1">
+      <w:start w:val="1"/>
+      <w:numFmt w:val="bullet"/>
+      <w:lvlText w:val=""/>
+      <w:lvlJc w:val="left"/>
+      <w:pPr>
+        <w:ind w:left="6480" w:hanging="360"/>
+      </w:pPr>
+      <w:rPr>
+        <w:rFonts w:ascii="Wingdings" w:hAnsi="Wingdings" w:hint="default"/>
+      </w:rPr>
+    </w:lvl>
+  </w:abstractNum>
+  <w:abstractNum w:abstractNumId="13" w15:restartNumberingAfterBreak="0">
     <w:nsid w:val="59D17716"/>
     <w:multiLevelType w:val="hybridMultilevel"/>
     <w:tmpl w:val="67769AC8"/>
@@ -10791,7 +13094,7 @@
       </w:rPr>
     </w:lvl>
   </w:abstractNum>
-  <w:abstractNum w:abstractNumId="8" w15:restartNumberingAfterBreak="0">
+  <w:abstractNum w:abstractNumId="14" w15:restartNumberingAfterBreak="0">
     <w:nsid w:val="5DE31A16"/>
     <w:multiLevelType w:val="hybridMultilevel"/>
     <w:tmpl w:val="D0201C50"/>
@@ -10877,7 +13180,7 @@
       </w:pPr>
     </w:lvl>
   </w:abstractNum>
-  <w:abstractNum w:abstractNumId="9" w15:restartNumberingAfterBreak="0">
+  <w:abstractNum w:abstractNumId="15" w15:restartNumberingAfterBreak="0">
     <w:nsid w:val="5EA072E4"/>
     <w:multiLevelType w:val="hybridMultilevel"/>
     <w:tmpl w:val="BF525D02"/>
@@ -10955,7 +13258,119 @@
       </w:pPr>
     </w:lvl>
   </w:abstractNum>
-  <w:abstractNum w:abstractNumId="10" w15:restartNumberingAfterBreak="0">
+  <w:abstractNum w:abstractNumId="16" w15:restartNumberingAfterBreak="0">
+    <w:nsid w:val="6F3A5F15"/>
+    <w:multiLevelType w:val="hybridMultilevel"/>
+    <w:tmpl w:val="6AAE0EB6"/>
+    <w:lvl w:ilvl="0" w:tplc="BA84D1E2">
+      <w:numFmt w:val="bullet"/>
+      <w:lvlText w:val="-"/>
+      <w:lvlJc w:val="left"/>
+      <w:pPr>
+        <w:ind w:left="720" w:hanging="360"/>
+      </w:pPr>
+      <w:rPr>
+        <w:rFonts w:ascii="Arial" w:eastAsia="Arial" w:hAnsi="Arial" w:cs="Arial" w:hint="default"/>
+      </w:rPr>
+    </w:lvl>
+    <w:lvl w:ilvl="1" w:tplc="04090003" w:tentative="1">
+      <w:start w:val="1"/>
+      <w:numFmt w:val="bullet"/>
+      <w:lvlText w:val="o"/>
+      <w:lvlJc w:val="left"/>
+      <w:pPr>
+        <w:ind w:left="1440" w:hanging="360"/>
+      </w:pPr>
+      <w:rPr>
+        <w:rFonts w:ascii="Courier New" w:hAnsi="Courier New" w:cs="Courier New" w:hint="default"/>
+      </w:rPr>
+    </w:lvl>
+    <w:lvl w:ilvl="2" w:tplc="04090005" w:tentative="1">
+      <w:start w:val="1"/>
+      <w:numFmt w:val="bullet"/>
+      <w:lvlText w:val=""/>
+      <w:lvlJc w:val="left"/>
+      <w:pPr>
+        <w:ind w:left="2160" w:hanging="360"/>
+      </w:pPr>
+      <w:rPr>
+        <w:rFonts w:ascii="Wingdings" w:hAnsi="Wingdings" w:hint="default"/>
+      </w:rPr>
+    </w:lvl>
+    <w:lvl w:ilvl="3" w:tplc="04090001" w:tentative="1">
+      <w:start w:val="1"/>
+      <w:numFmt w:val="bullet"/>
+      <w:lvlText w:val=""/>
+      <w:lvlJc w:val="left"/>
+      <w:pPr>
+        <w:ind w:left="2880" w:hanging="360"/>
+      </w:pPr>
+      <w:rPr>
+        <w:rFonts w:ascii="Symbol" w:hAnsi="Symbol" w:hint="default"/>
+      </w:rPr>
+    </w:lvl>
+    <w:lvl w:ilvl="4" w:tplc="04090003" w:tentative="1">
+      <w:start w:val="1"/>
+      <w:numFmt w:val="bullet"/>
+      <w:lvlText w:val="o"/>
+      <w:lvlJc w:val="left"/>
+      <w:pPr>
+        <w:ind w:left="3600" w:hanging="360"/>
+      </w:pPr>
+      <w:rPr>
+        <w:rFonts w:ascii="Courier New" w:hAnsi="Courier New" w:cs="Courier New" w:hint="default"/>
+      </w:rPr>
+    </w:lvl>
+    <w:lvl w:ilvl="5" w:tplc="04090005" w:tentative="1">
+      <w:start w:val="1"/>
+      <w:numFmt w:val="bullet"/>
+      <w:lvlText w:val=""/>
+      <w:lvlJc w:val="left"/>
+      <w:pPr>
+        <w:ind w:left="4320" w:hanging="360"/>
+      </w:pPr>
+      <w:rPr>
+        <w:rFonts w:ascii="Wingdings" w:hAnsi="Wingdings" w:hint="default"/>
+      </w:rPr>
+    </w:lvl>
+    <w:lvl w:ilvl="6" w:tplc="04090001" w:tentative="1">
+      <w:start w:val="1"/>
+      <w:numFmt w:val="bullet"/>
+      <w:lvlText w:val=""/>
+      <w:lvlJc w:val="left"/>
+      <w:pPr>
+        <w:ind w:left="5040" w:hanging="360"/>
+      </w:pPr>
+      <w:rPr>
+        <w:rFonts w:ascii="Symbol" w:hAnsi="Symbol" w:hint="default"/>
+      </w:rPr>
+    </w:lvl>
+    <w:lvl w:ilvl="7" w:tplc="04090003" w:tentative="1">
+      <w:start w:val="1"/>
+      <w:numFmt w:val="bullet"/>
+      <w:lvlText w:val="o"/>
+      <w:lvlJc w:val="left"/>
+      <w:pPr>
+        <w:ind w:left="5760" w:hanging="360"/>
+      </w:pPr>
+      <w:rPr>
+        <w:rFonts w:ascii="Courier New" w:hAnsi="Courier New" w:cs="Courier New" w:hint="default"/>
+      </w:rPr>
+    </w:lvl>
+    <w:lvl w:ilvl="8" w:tplc="04090005" w:tentative="1">
+      <w:start w:val="1"/>
+      <w:numFmt w:val="bullet"/>
+      <w:lvlText w:val=""/>
+      <w:lvlJc w:val="left"/>
+      <w:pPr>
+        <w:ind w:left="6480" w:hanging="360"/>
+      </w:pPr>
+      <w:rPr>
+        <w:rFonts w:ascii="Wingdings" w:hAnsi="Wingdings" w:hint="default"/>
+      </w:rPr>
+    </w:lvl>
+  </w:abstractNum>
+  <w:abstractNum w:abstractNumId="17" w15:restartNumberingAfterBreak="0">
     <w:nsid w:val="74FD5B25"/>
     <w:multiLevelType w:val="hybridMultilevel"/>
     <w:tmpl w:val="DDA46C96"/>
@@ -11041,44 +13456,180 @@
       </w:pPr>
     </w:lvl>
   </w:abstractNum>
+  <w:abstractNum w:abstractNumId="18" w15:restartNumberingAfterBreak="0">
+    <w:nsid w:val="7C33011B"/>
+    <w:multiLevelType w:val="hybridMultilevel"/>
+    <w:tmpl w:val="F9AE192E"/>
+    <w:lvl w:ilvl="0" w:tplc="8CECB504">
+      <w:numFmt w:val="bullet"/>
+      <w:lvlText w:val="-"/>
+      <w:lvlJc w:val="left"/>
+      <w:pPr>
+        <w:ind w:left="540" w:hanging="360"/>
+      </w:pPr>
+      <w:rPr>
+        <w:rFonts w:ascii="Arial" w:eastAsia="Arial" w:hAnsi="Arial" w:cs="Arial" w:hint="default"/>
+      </w:rPr>
+    </w:lvl>
+    <w:lvl w:ilvl="1" w:tplc="04090003" w:tentative="1">
+      <w:start w:val="1"/>
+      <w:numFmt w:val="bullet"/>
+      <w:lvlText w:val="o"/>
+      <w:lvlJc w:val="left"/>
+      <w:pPr>
+        <w:ind w:left="1260" w:hanging="360"/>
+      </w:pPr>
+      <w:rPr>
+        <w:rFonts w:ascii="Courier New" w:hAnsi="Courier New" w:cs="Courier New" w:hint="default"/>
+      </w:rPr>
+    </w:lvl>
+    <w:lvl w:ilvl="2" w:tplc="04090005" w:tentative="1">
+      <w:start w:val="1"/>
+      <w:numFmt w:val="bullet"/>
+      <w:lvlText w:val=""/>
+      <w:lvlJc w:val="left"/>
+      <w:pPr>
+        <w:ind w:left="1980" w:hanging="360"/>
+      </w:pPr>
+      <w:rPr>
+        <w:rFonts w:ascii="Wingdings" w:hAnsi="Wingdings" w:hint="default"/>
+      </w:rPr>
+    </w:lvl>
+    <w:lvl w:ilvl="3" w:tplc="04090001" w:tentative="1">
+      <w:start w:val="1"/>
+      <w:numFmt w:val="bullet"/>
+      <w:lvlText w:val=""/>
+      <w:lvlJc w:val="left"/>
+      <w:pPr>
+        <w:ind w:left="2700" w:hanging="360"/>
+      </w:pPr>
+      <w:rPr>
+        <w:rFonts w:ascii="Symbol" w:hAnsi="Symbol" w:hint="default"/>
+      </w:rPr>
+    </w:lvl>
+    <w:lvl w:ilvl="4" w:tplc="04090003" w:tentative="1">
+      <w:start w:val="1"/>
+      <w:numFmt w:val="bullet"/>
+      <w:lvlText w:val="o"/>
+      <w:lvlJc w:val="left"/>
+      <w:pPr>
+        <w:ind w:left="3420" w:hanging="360"/>
+      </w:pPr>
+      <w:rPr>
+        <w:rFonts w:ascii="Courier New" w:hAnsi="Courier New" w:cs="Courier New" w:hint="default"/>
+      </w:rPr>
+    </w:lvl>
+    <w:lvl w:ilvl="5" w:tplc="04090005" w:tentative="1">
+      <w:start w:val="1"/>
+      <w:numFmt w:val="bullet"/>
+      <w:lvlText w:val=""/>
+      <w:lvlJc w:val="left"/>
+      <w:pPr>
+        <w:ind w:left="4140" w:hanging="360"/>
+      </w:pPr>
+      <w:rPr>
+        <w:rFonts w:ascii="Wingdings" w:hAnsi="Wingdings" w:hint="default"/>
+      </w:rPr>
+    </w:lvl>
+    <w:lvl w:ilvl="6" w:tplc="04090001" w:tentative="1">
+      <w:start w:val="1"/>
+      <w:numFmt w:val="bullet"/>
+      <w:lvlText w:val=""/>
+      <w:lvlJc w:val="left"/>
+      <w:pPr>
+        <w:ind w:left="4860" w:hanging="360"/>
+      </w:pPr>
+      <w:rPr>
+        <w:rFonts w:ascii="Symbol" w:hAnsi="Symbol" w:hint="default"/>
+      </w:rPr>
+    </w:lvl>
+    <w:lvl w:ilvl="7" w:tplc="04090003" w:tentative="1">
+      <w:start w:val="1"/>
+      <w:numFmt w:val="bullet"/>
+      <w:lvlText w:val="o"/>
+      <w:lvlJc w:val="left"/>
+      <w:pPr>
+        <w:ind w:left="5580" w:hanging="360"/>
+      </w:pPr>
+      <w:rPr>
+        <w:rFonts w:ascii="Courier New" w:hAnsi="Courier New" w:cs="Courier New" w:hint="default"/>
+      </w:rPr>
+    </w:lvl>
+    <w:lvl w:ilvl="8" w:tplc="04090005" w:tentative="1">
+      <w:start w:val="1"/>
+      <w:numFmt w:val="bullet"/>
+      <w:lvlText w:val=""/>
+      <w:lvlJc w:val="left"/>
+      <w:pPr>
+        <w:ind w:left="6300" w:hanging="360"/>
+      </w:pPr>
+      <w:rPr>
+        <w:rFonts w:ascii="Wingdings" w:hAnsi="Wingdings" w:hint="default"/>
+      </w:rPr>
+    </w:lvl>
+  </w:abstractNum>
   <w:num w:numId="1" w16cid:durableId="782501488">
-    <w:abstractNumId w:val="4"/>
+    <w:abstractNumId w:val="8"/>
     <w:lvlOverride w:ilvl="0">
       <w:startOverride w:val="1"/>
     </w:lvlOverride>
   </w:num>
   <w:num w:numId="2" w16cid:durableId="1747143911">
-    <w:abstractNumId w:val="5"/>
+    <w:abstractNumId w:val="9"/>
     <w:lvlOverride w:ilvl="0">
       <w:startOverride w:val="1"/>
     </w:lvlOverride>
   </w:num>
   <w:num w:numId="3" w16cid:durableId="2079479679">
-    <w:abstractNumId w:val="9"/>
+    <w:abstractNumId w:val="15"/>
   </w:num>
   <w:num w:numId="4" w16cid:durableId="131095708">
-    <w:abstractNumId w:val="1"/>
+    <w:abstractNumId w:val="2"/>
   </w:num>
   <w:num w:numId="5" w16cid:durableId="530532748">
-    <w:abstractNumId w:val="3"/>
+    <w:abstractNumId w:val="7"/>
   </w:num>
   <w:num w:numId="6" w16cid:durableId="1587809626">
     <w:abstractNumId w:val="0"/>
   </w:num>
   <w:num w:numId="7" w16cid:durableId="950473397">
-    <w:abstractNumId w:val="8"/>
+    <w:abstractNumId w:val="14"/>
   </w:num>
   <w:num w:numId="8" w16cid:durableId="1217427039">
+    <w:abstractNumId w:val="17"/>
+  </w:num>
+  <w:num w:numId="9" w16cid:durableId="1882283806">
+    <w:abstractNumId w:val="13"/>
+  </w:num>
+  <w:num w:numId="10" w16cid:durableId="1452630397">
+    <w:abstractNumId w:val="6"/>
+  </w:num>
+  <w:num w:numId="11" w16cid:durableId="1565020556">
+    <w:abstractNumId w:val="11"/>
+  </w:num>
+  <w:num w:numId="12" w16cid:durableId="783616179">
+    <w:abstractNumId w:val="4"/>
+  </w:num>
+  <w:num w:numId="13" w16cid:durableId="709838917">
+    <w:abstractNumId w:val="18"/>
+  </w:num>
+  <w:num w:numId="14" w16cid:durableId="856965001">
+    <w:abstractNumId w:val="12"/>
+  </w:num>
+  <w:num w:numId="15" w16cid:durableId="555817212">
+    <w:abstractNumId w:val="3"/>
+  </w:num>
+  <w:num w:numId="16" w16cid:durableId="504516338">
     <w:abstractNumId w:val="10"/>
   </w:num>
-  <w:num w:numId="9" w16cid:durableId="1882283806">
-    <w:abstractNumId w:val="7"/>
+  <w:num w:numId="17" w16cid:durableId="458304338">
+    <w:abstractNumId w:val="5"/>
   </w:num>
-  <w:num w:numId="10" w16cid:durableId="1452630397">
-    <w:abstractNumId w:val="2"/>
+  <w:num w:numId="18" w16cid:durableId="1629898408">
+    <w:abstractNumId w:val="16"/>
   </w:num>
-  <w:num w:numId="11" w16cid:durableId="1565020556">
-    <w:abstractNumId w:val="6"/>
+  <w:num w:numId="19" w16cid:durableId="1001664398">
+    <w:abstractNumId w:val="1"/>
   </w:num>
 </w:numbering>
 </file>

</xml_diff>